<commit_message>
feat(classes & ajouts): modification des dernières fonctions en classes, modifications de certaines de celle-ci avec quelques ajustements et ajout de nouvelles classes
</commit_message>
<xml_diff>
--- a/doc/P-P_OO-LeoBouzon-TowerDefenseRapport.docx
+++ b/doc/P-P_OO-LeoBouzon-TowerDefenseRapport.docx
@@ -463,7 +463,15 @@
         <w:t xml:space="preserve">A travers ce projet nous allons également </w:t>
       </w:r>
       <w:r>
-        <w:t>réaliser de l’orienté-objet</w:t>
+        <w:t xml:space="preserve">réaliser de </w:t>
+      </w:r>
+      <w:proofErr w:type="gramStart"/>
+      <w:r>
+        <w:t>l’orienté</w:t>
+      </w:r>
+      <w:proofErr w:type="gramEnd"/>
+      <w:r>
+        <w:t>-objet</w:t>
       </w:r>
       <w:r>
         <w:t xml:space="preserve"> qui sera implémenté au fur et à mesure de celui-ci.</w:t>
@@ -498,9 +506,11 @@
       <w:r>
         <w:t xml:space="preserve"> </w:t>
       </w:r>
+      <w:proofErr w:type="spellStart"/>
       <w:r>
         <w:t>Defense</w:t>
       </w:r>
+      <w:proofErr w:type="spellEnd"/>
       <w:r>
         <w:t>. Malgré la complexité</w:t>
       </w:r>
@@ -514,6 +524,7 @@
         <w:t>à des réflexions plus profondes.</w:t>
       </w:r>
     </w:p>
+    <w:p/>
     <w:p>
       <w:pPr>
         <w:pStyle w:val="Titre1"/>
@@ -1953,23 +1964,6 @@
 </file>
 
 <file path=customXml/item1.xml><?xml version="1.0" encoding="utf-8"?>
-<p:properties xmlns:p="http://schemas.microsoft.com/office/2006/metadata/properties" xmlns:xsi="http://www.w3.org/2001/XMLSchema-instance" xmlns:pc="http://schemas.microsoft.com/office/infopath/2007/PartnerControls">
-  <documentManagement>
-    <_activity xmlns="308fd9e7-0be8-44ba-81f3-723628cb95d5" xsi:nil="true"/>
-  </documentManagement>
-</p:properties>
-</file>
-
-<file path=customXml/item2.xml><?xml version="1.0" encoding="utf-8"?>
-<?mso-contentType ?>
-<FormTemplates xmlns="http://schemas.microsoft.com/sharepoint/v3/contenttype/forms">
-  <Display>DocumentLibraryForm</Display>
-  <Edit>DocumentLibraryForm</Edit>
-  <New>DocumentLibraryForm</New>
-</FormTemplates>
-</file>
-
-<file path=customXml/item3.xml><?xml version="1.0" encoding="utf-8"?>
 <ct:contentTypeSchema xmlns:ct="http://schemas.microsoft.com/office/2006/metadata/contentType" xmlns:ma="http://schemas.microsoft.com/office/2006/metadata/properties/metaAttributes" ct:_="" ma:_="" ma:contentTypeName="Document" ma:contentTypeID="0x010100288F302392E73041B6BCE39E03C2BCED" ma:contentTypeVersion="15" ma:contentTypeDescription="Crée un document." ma:contentTypeScope="" ma:versionID="1cf235e546ce90db4c4501e9d290c24f">
   <xsd:schema xmlns:xsd="http://www.w3.org/2001/XMLSchema" xmlns:xs="http://www.w3.org/2001/XMLSchema" xmlns:p="http://schemas.microsoft.com/office/2006/metadata/properties" xmlns:ns3="308fd9e7-0be8-44ba-81f3-723628cb95d5" xmlns:ns4="02e62082-1ed3-4499-b3c5-d63020de9536" targetNamespace="http://schemas.microsoft.com/office/2006/metadata/properties" ma:root="true" ma:fieldsID="47328239e90fec05ec528af41ca73e6c" ns3:_="" ns4:_="">
     <xsd:import namespace="308fd9e7-0be8-44ba-81f3-723628cb95d5"/>
@@ -2202,36 +2196,28 @@
 </ct:contentTypeSchema>
 </file>
 
+<file path=customXml/item2.xml><?xml version="1.0" encoding="utf-8"?>
+<?mso-contentType ?>
+<FormTemplates xmlns="http://schemas.microsoft.com/sharepoint/v3/contenttype/forms">
+  <Display>DocumentLibraryForm</Display>
+  <Edit>DocumentLibraryForm</Edit>
+  <New>DocumentLibraryForm</New>
+</FormTemplates>
+</file>
+
+<file path=customXml/item3.xml><?xml version="1.0" encoding="utf-8"?>
+<p:properties xmlns:p="http://schemas.microsoft.com/office/2006/metadata/properties" xmlns:xsi="http://www.w3.org/2001/XMLSchema-instance" xmlns:pc="http://schemas.microsoft.com/office/infopath/2007/PartnerControls">
+  <documentManagement>
+    <_activity xmlns="308fd9e7-0be8-44ba-81f3-723628cb95d5" xsi:nil="true"/>
+  </documentManagement>
+</p:properties>
+</file>
+
 <file path=customXml/item4.xml><?xml version="1.0" encoding="utf-8"?>
 <b:Sources xmlns:b="http://schemas.openxmlformats.org/officeDocument/2006/bibliography" xmlns="http://schemas.openxmlformats.org/officeDocument/2006/bibliography" SelectedStyle="\APASixthEditionOfficeOnline.xsl" StyleName="APA" Version="6"/>
 </file>
 
 <file path=customXml/itemProps1.xml><?xml version="1.0" encoding="utf-8"?>
-<ds:datastoreItem xmlns:ds="http://schemas.openxmlformats.org/officeDocument/2006/customXml" ds:itemID="{A2F67D70-1D7D-41F5-917E-8D20C262458F}">
-  <ds:schemaRefs>
-    <ds:schemaRef ds:uri="http://schemas.microsoft.com/office/2006/documentManagement/types"/>
-    <ds:schemaRef ds:uri="http://purl.org/dc/terms/"/>
-    <ds:schemaRef ds:uri="http://www.w3.org/XML/1998/namespace"/>
-    <ds:schemaRef ds:uri="http://schemas.microsoft.com/office/infopath/2007/PartnerControls"/>
-    <ds:schemaRef ds:uri="http://schemas.microsoft.com/office/2006/metadata/properties"/>
-    <ds:schemaRef ds:uri="http://purl.org/dc/elements/1.1/"/>
-    <ds:schemaRef ds:uri="http://schemas.openxmlformats.org/package/2006/metadata/core-properties"/>
-    <ds:schemaRef ds:uri="02e62082-1ed3-4499-b3c5-d63020de9536"/>
-    <ds:schemaRef ds:uri="308fd9e7-0be8-44ba-81f3-723628cb95d5"/>
-    <ds:schemaRef ds:uri="http://purl.org/dc/dcmitype/"/>
-  </ds:schemaRefs>
-</ds:datastoreItem>
-</file>
-
-<file path=customXml/itemProps2.xml><?xml version="1.0" encoding="utf-8"?>
-<ds:datastoreItem xmlns:ds="http://schemas.openxmlformats.org/officeDocument/2006/customXml" ds:itemID="{894FF3D7-A3AD-4389-89EC-D084FE70A6B4}">
-  <ds:schemaRefs>
-    <ds:schemaRef ds:uri="http://schemas.microsoft.com/sharepoint/v3/contenttype/forms"/>
-  </ds:schemaRefs>
-</ds:datastoreItem>
-</file>
-
-<file path=customXml/itemProps3.xml><?xml version="1.0" encoding="utf-8"?>
 <ds:datastoreItem xmlns:ds="http://schemas.openxmlformats.org/officeDocument/2006/customXml" ds:itemID="{4694D7C3-DDF8-411A-A9D5-2382FE8DD951}">
   <ds:schemaRefs>
     <ds:schemaRef ds:uri="http://schemas.microsoft.com/office/2006/metadata/contentType"/>
@@ -2250,6 +2236,24 @@
 </ds:datastoreItem>
 </file>
 
+<file path=customXml/itemProps2.xml><?xml version="1.0" encoding="utf-8"?>
+<ds:datastoreItem xmlns:ds="http://schemas.openxmlformats.org/officeDocument/2006/customXml" ds:itemID="{894FF3D7-A3AD-4389-89EC-D084FE70A6B4}">
+  <ds:schemaRefs>
+    <ds:schemaRef ds:uri="http://schemas.microsoft.com/sharepoint/v3/contenttype/forms"/>
+  </ds:schemaRefs>
+</ds:datastoreItem>
+</file>
+
+<file path=customXml/itemProps3.xml><?xml version="1.0" encoding="utf-8"?>
+<ds:datastoreItem xmlns:ds="http://schemas.openxmlformats.org/officeDocument/2006/customXml" ds:itemID="{A2F67D70-1D7D-41F5-917E-8D20C262458F}">
+  <ds:schemaRefs>
+    <ds:schemaRef ds:uri="http://schemas.microsoft.com/office/2006/metadata/properties"/>
+    <ds:schemaRef ds:uri="http://schemas.microsoft.com/office/infopath/2007/PartnerControls"/>
+    <ds:schemaRef ds:uri="308fd9e7-0be8-44ba-81f3-723628cb95d5"/>
+  </ds:schemaRefs>
+</ds:datastoreItem>
+</file>
+
 <file path=customXml/itemProps4.xml><?xml version="1.0" encoding="utf-8"?>
 <ds:datastoreItem xmlns:ds="http://schemas.openxmlformats.org/officeDocument/2006/customXml" ds:itemID="{492A4094-C0CE-4806-A03B-AA967586A57B}">
   <ds:schemaRefs>

</xml_diff>

<commit_message>
feat(v2 terminée): Dernière finition nécessaire à la v2 + implémentation du projectile
</commit_message>
<xml_diff>
--- a/doc/P-P_OO-LeoBouzon-TowerDefenseRapport.docx
+++ b/doc/P-P_OO-LeoBouzon-TowerDefenseRapport.docx
@@ -5,6 +5,9 @@
     <w:p>
       <w:pPr>
         <w:pStyle w:val="Titre"/>
+        <w:tabs>
+          <w:tab w:val="left" w:pos="2694"/>
+        </w:tabs>
       </w:pPr>
       <w:r>
         <w:t xml:space="preserve">TOWER DEFENSE </w:t>
@@ -13,6 +16,9 @@
     <w:p>
       <w:pPr>
         <w:pStyle w:val="Sous-titre"/>
+        <w:tabs>
+          <w:tab w:val="left" w:pos="2694"/>
+        </w:tabs>
       </w:pPr>
       <w:r>
         <w:t>Léo Bouzon</w:t>
@@ -20,11 +26,16 @@
     </w:p>
     <w:p>
       <w:pPr>
+        <w:tabs>
+          <w:tab w:val="left" w:pos="2694"/>
+        </w:tabs>
         <w:sectPr>
-          <w:footerReference w:type="default" r:id="rId10"/>
-          <w:pgSz w:w="11906" w:h="16838"/>
-          <w:pgMar w:top="1417" w:right="1417" w:bottom="1417" w:left="1417" w:header="708" w:footer="708" w:gutter="0"/>
+          <w:headerReference w:type="default" r:id="rId10"/>
+          <w:footerReference w:type="default" r:id="rId11"/>
+          <w:pgSz w:w="11906" w:h="16838" w:code="9"/>
+          <w:pgMar w:top="1418" w:right="1418" w:bottom="1418" w:left="1418" w:header="709" w:footer="709" w:gutter="0"/>
           <w:cols w:space="708"/>
+          <w:vAlign w:val="center"/>
           <w:titlePg/>
           <w:docGrid w:linePitch="360"/>
         </w:sectPr>
@@ -398,7 +409,8 @@
     <w:p>
       <w:pPr>
         <w:sectPr>
-          <w:headerReference w:type="first" r:id="rId11"/>
+          <w:headerReference w:type="first" r:id="rId12"/>
+          <w:footerReference w:type="first" r:id="rId13"/>
           <w:pgSz w:w="11906" w:h="16838"/>
           <w:pgMar w:top="1417" w:right="1417" w:bottom="1417" w:left="1417" w:header="708" w:footer="708" w:gutter="0"/>
           <w:cols w:space="708"/>
@@ -547,8 +559,6 @@
       </w:r>
       <w:bookmarkEnd w:id="3"/>
     </w:p>
-    <w:p/>
-    <w:p/>
     <w:p>
       <w:pPr>
         <w:pStyle w:val="Titre1"/>
@@ -635,6 +645,16 @@
 </w:ftr>
 </file>
 
+<file path=word/footer2.xml><?xml version="1.0" encoding="utf-8"?>
+<w:ftr xmlns:wpc="http://schemas.microsoft.com/office/word/2010/wordprocessingCanvas" xmlns:cx="http://schemas.microsoft.com/office/drawing/2014/chartex" xmlns:cx1="http://schemas.microsoft.com/office/drawing/2015/9/8/chartex" xmlns:cx2="http://schemas.microsoft.com/office/drawing/2015/10/21/chartex" xmlns:cx3="http://schemas.microsoft.com/office/drawing/2016/5/9/chartex" xmlns:cx4="http://schemas.microsoft.com/office/drawing/2016/5/10/chartex" xmlns:cx5="http://schemas.microsoft.com/office/drawing/2016/5/11/chartex" xmlns:cx6="http://schemas.microsoft.com/office/drawing/2016/5/12/chartex" xmlns:cx7="http://schemas.microsoft.com/office/drawing/2016/5/13/chartex" xmlns:cx8="http://schemas.microsoft.com/office/drawing/2016/5/14/chartex" xmlns:mc="http://schemas.openxmlformats.org/markup-compatibility/2006" xmlns:aink="http://schemas.microsoft.com/office/drawing/2016/ink" xmlns:am3d="http://schemas.microsoft.com/office/drawing/2017/model3d" xmlns:o="urn:schemas-microsoft-com:office:office" xmlns:oel="http://schemas.microsoft.com/office/2019/extlst" xmlns:r="http://schemas.openxmlformats.org/officeDocument/2006/relationships" xmlns:m="http://schemas.openxmlformats.org/officeDocument/2006/math" xmlns:v="urn:schemas-microsoft-com:vml" xmlns:wp14="http://schemas.microsoft.com/office/word/2010/wordprocessingDrawing" xmlns:wp="http://schemas.openxmlformats.org/drawingml/2006/wordprocessingDrawing" xmlns:w10="urn:schemas-microsoft-com:office:word" xmlns:w="http://schemas.openxmlformats.org/wordprocessingml/2006/main" xmlns:w14="http://schemas.microsoft.com/office/word/2010/wordml" xmlns:w15="http://schemas.microsoft.com/office/word/2012/wordml" xmlns:w16cex="http://schemas.microsoft.com/office/word/2018/wordml/cex" xmlns:w16cid="http://schemas.microsoft.com/office/word/2016/wordml/cid" xmlns:w16="http://schemas.microsoft.com/office/word/2018/wordml" xmlns:w16sdtdh="http://schemas.microsoft.com/office/word/2020/wordml/sdtdatahash" xmlns:w16se="http://schemas.microsoft.com/office/word/2015/wordml/symex" xmlns:wpg="http://schemas.microsoft.com/office/word/2010/wordprocessingGroup" xmlns:wpi="http://schemas.microsoft.com/office/word/2010/wordprocessingInk" xmlns:wne="http://schemas.microsoft.com/office/word/2006/wordml" xmlns:wps="http://schemas.microsoft.com/office/word/2010/wordprocessingShape" mc:Ignorable="w14 w15 w16se w16cid w16 w16cex w16sdtdh wp14">
+  <w:p>
+    <w:pPr>
+      <w:pStyle w:val="Pieddepage"/>
+    </w:pPr>
+  </w:p>
+</w:ftr>
+</file>
+
 <file path=word/footnotes.xml><?xml version="1.0" encoding="utf-8"?>
 <w:footnotes xmlns:wpc="http://schemas.microsoft.com/office/word/2010/wordprocessingCanvas" xmlns:cx="http://schemas.microsoft.com/office/drawing/2014/chartex" xmlns:cx1="http://schemas.microsoft.com/office/drawing/2015/9/8/chartex" xmlns:cx2="http://schemas.microsoft.com/office/drawing/2015/10/21/chartex" xmlns:cx3="http://schemas.microsoft.com/office/drawing/2016/5/9/chartex" xmlns:cx4="http://schemas.microsoft.com/office/drawing/2016/5/10/chartex" xmlns:cx5="http://schemas.microsoft.com/office/drawing/2016/5/11/chartex" xmlns:cx6="http://schemas.microsoft.com/office/drawing/2016/5/12/chartex" xmlns:cx7="http://schemas.microsoft.com/office/drawing/2016/5/13/chartex" xmlns:cx8="http://schemas.microsoft.com/office/drawing/2016/5/14/chartex" xmlns:mc="http://schemas.openxmlformats.org/markup-compatibility/2006" xmlns:aink="http://schemas.microsoft.com/office/drawing/2016/ink" xmlns:am3d="http://schemas.microsoft.com/office/drawing/2017/model3d" xmlns:o="urn:schemas-microsoft-com:office:office" xmlns:oel="http://schemas.microsoft.com/office/2019/extlst" xmlns:r="http://schemas.openxmlformats.org/officeDocument/2006/relationships" xmlns:m="http://schemas.openxmlformats.org/officeDocument/2006/math" xmlns:v="urn:schemas-microsoft-com:vml" xmlns:wp14="http://schemas.microsoft.com/office/word/2010/wordprocessingDrawing" xmlns:wp="http://schemas.openxmlformats.org/drawingml/2006/wordprocessingDrawing" xmlns:w10="urn:schemas-microsoft-com:office:word" xmlns:w="http://schemas.openxmlformats.org/wordprocessingml/2006/main" xmlns:w14="http://schemas.microsoft.com/office/word/2010/wordml" xmlns:w15="http://schemas.microsoft.com/office/word/2012/wordml" xmlns:w16cex="http://schemas.microsoft.com/office/word/2018/wordml/cex" xmlns:w16cid="http://schemas.microsoft.com/office/word/2016/wordml/cid" xmlns:w16="http://schemas.microsoft.com/office/word/2018/wordml" xmlns:w16sdtdh="http://schemas.microsoft.com/office/word/2020/wordml/sdtdatahash" xmlns:w16se="http://schemas.microsoft.com/office/word/2015/wordml/symex" xmlns:wpg="http://schemas.microsoft.com/office/word/2010/wordprocessingGroup" xmlns:wpi="http://schemas.microsoft.com/office/word/2010/wordprocessingInk" xmlns:wne="http://schemas.microsoft.com/office/word/2006/wordml" xmlns:wps="http://schemas.microsoft.com/office/word/2010/wordprocessingShape" mc:Ignorable="w14 w15 w16se w16cid w16 w16cex w16sdtdh wp14">
   <w:footnote w:type="separator" w:id="-1">
@@ -661,6 +681,49 @@
 </file>
 
 <file path=word/header1.xml><?xml version="1.0" encoding="utf-8"?>
+<w:hdr xmlns:wpc="http://schemas.microsoft.com/office/word/2010/wordprocessingCanvas" xmlns:cx="http://schemas.microsoft.com/office/drawing/2014/chartex" xmlns:cx1="http://schemas.microsoft.com/office/drawing/2015/9/8/chartex" xmlns:cx2="http://schemas.microsoft.com/office/drawing/2015/10/21/chartex" xmlns:cx3="http://schemas.microsoft.com/office/drawing/2016/5/9/chartex" xmlns:cx4="http://schemas.microsoft.com/office/drawing/2016/5/10/chartex" xmlns:cx5="http://schemas.microsoft.com/office/drawing/2016/5/11/chartex" xmlns:cx6="http://schemas.microsoft.com/office/drawing/2016/5/12/chartex" xmlns:cx7="http://schemas.microsoft.com/office/drawing/2016/5/13/chartex" xmlns:cx8="http://schemas.microsoft.com/office/drawing/2016/5/14/chartex" xmlns:mc="http://schemas.openxmlformats.org/markup-compatibility/2006" xmlns:aink="http://schemas.microsoft.com/office/drawing/2016/ink" xmlns:am3d="http://schemas.microsoft.com/office/drawing/2017/model3d" xmlns:o="urn:schemas-microsoft-com:office:office" xmlns:oel="http://schemas.microsoft.com/office/2019/extlst" xmlns:r="http://schemas.openxmlformats.org/officeDocument/2006/relationships" xmlns:m="http://schemas.openxmlformats.org/officeDocument/2006/math" xmlns:v="urn:schemas-microsoft-com:vml" xmlns:wp14="http://schemas.microsoft.com/office/word/2010/wordprocessingDrawing" xmlns:wp="http://schemas.openxmlformats.org/drawingml/2006/wordprocessingDrawing" xmlns:w10="urn:schemas-microsoft-com:office:word" xmlns:w="http://schemas.openxmlformats.org/wordprocessingml/2006/main" xmlns:w14="http://schemas.microsoft.com/office/word/2010/wordml" xmlns:w15="http://schemas.microsoft.com/office/word/2012/wordml" xmlns:w16cex="http://schemas.microsoft.com/office/word/2018/wordml/cex" xmlns:w16cid="http://schemas.microsoft.com/office/word/2016/wordml/cid" xmlns:w16="http://schemas.microsoft.com/office/word/2018/wordml" xmlns:w16sdtdh="http://schemas.microsoft.com/office/word/2020/wordml/sdtdatahash" xmlns:w16se="http://schemas.microsoft.com/office/word/2015/wordml/symex" xmlns:wpg="http://schemas.microsoft.com/office/word/2010/wordprocessingGroup" xmlns:wpi="http://schemas.microsoft.com/office/word/2010/wordprocessingInk" xmlns:wne="http://schemas.microsoft.com/office/word/2006/wordml" xmlns:wps="http://schemas.microsoft.com/office/word/2010/wordprocessingShape" mc:Ignorable="w14 w15 w16se w16cid w16 w16cex w16sdtdh wp14">
+  <w:p>
+    <w:pPr>
+      <w:pStyle w:val="En-tte"/>
+    </w:pPr>
+    <w:r>
+      <w:t xml:space="preserve">Léo Bouzon </w:t>
+    </w:r>
+    <w:r>
+      <w:tab/>
+    </w:r>
+    <w:r>
+      <w:tab/>
+    </w:r>
+    <w:r>
+      <w:fldChar w:fldCharType="begin"/>
+    </w:r>
+    <w:r>
+      <w:instrText xml:space="preserve"> CREATEDATE  \@ "dd.MM.yyyy"  \* MERGEFORMAT </w:instrText>
+    </w:r>
+    <w:r>
+      <w:fldChar w:fldCharType="separate"/>
+    </w:r>
+    <w:r>
+      <w:rPr>
+        <w:noProof/>
+      </w:rPr>
+      <w:t>11.02</w:t>
+    </w:r>
+    <w:r>
+      <w:rPr>
+        <w:noProof/>
+      </w:rPr>
+      <w:t>.2026</w:t>
+    </w:r>
+    <w:r>
+      <w:fldChar w:fldCharType="end"/>
+    </w:r>
+  </w:p>
+</w:hdr>
+</file>
+
+<file path=word/header2.xml><?xml version="1.0" encoding="utf-8"?>
 <w:hdr xmlns:wpc="http://schemas.microsoft.com/office/word/2010/wordprocessingCanvas" xmlns:cx="http://schemas.microsoft.com/office/drawing/2014/chartex" xmlns:cx1="http://schemas.microsoft.com/office/drawing/2015/9/8/chartex" xmlns:cx2="http://schemas.microsoft.com/office/drawing/2015/10/21/chartex" xmlns:cx3="http://schemas.microsoft.com/office/drawing/2016/5/9/chartex" xmlns:cx4="http://schemas.microsoft.com/office/drawing/2016/5/10/chartex" xmlns:cx5="http://schemas.microsoft.com/office/drawing/2016/5/11/chartex" xmlns:cx6="http://schemas.microsoft.com/office/drawing/2016/5/12/chartex" xmlns:cx7="http://schemas.microsoft.com/office/drawing/2016/5/13/chartex" xmlns:cx8="http://schemas.microsoft.com/office/drawing/2016/5/14/chartex" xmlns:mc="http://schemas.openxmlformats.org/markup-compatibility/2006" xmlns:aink="http://schemas.microsoft.com/office/drawing/2016/ink" xmlns:am3d="http://schemas.microsoft.com/office/drawing/2017/model3d" xmlns:o="urn:schemas-microsoft-com:office:office" xmlns:oel="http://schemas.microsoft.com/office/2019/extlst" xmlns:r="http://schemas.openxmlformats.org/officeDocument/2006/relationships" xmlns:m="http://schemas.openxmlformats.org/officeDocument/2006/math" xmlns:v="urn:schemas-microsoft-com:vml" xmlns:wp14="http://schemas.microsoft.com/office/word/2010/wordprocessingDrawing" xmlns:wp="http://schemas.openxmlformats.org/drawingml/2006/wordprocessingDrawing" xmlns:w10="urn:schemas-microsoft-com:office:word" xmlns:w="http://schemas.openxmlformats.org/wordprocessingml/2006/main" xmlns:w14="http://schemas.microsoft.com/office/word/2010/wordml" xmlns:w15="http://schemas.microsoft.com/office/word/2012/wordml" xmlns:w16cex="http://schemas.microsoft.com/office/word/2018/wordml/cex" xmlns:w16cid="http://schemas.microsoft.com/office/word/2016/wordml/cid" xmlns:w16="http://schemas.microsoft.com/office/word/2018/wordml" xmlns:w16sdtdh="http://schemas.microsoft.com/office/word/2020/wordml/sdtdatahash" xmlns:w16se="http://schemas.microsoft.com/office/word/2015/wordml/symex" xmlns:wpg="http://schemas.microsoft.com/office/word/2010/wordprocessingGroup" xmlns:wpi="http://schemas.microsoft.com/office/word/2010/wordprocessingInk" xmlns:wne="http://schemas.microsoft.com/office/word/2006/wordml" xmlns:wps="http://schemas.microsoft.com/office/word/2010/wordprocessingShape" mc:Ignorable="w14 w15 w16se w16cid w16 w16cex w16sdtdh wp14">
   <w:p>
     <w:pPr>
@@ -1078,7 +1141,7 @@
     <w:link w:val="Titre1Car"/>
     <w:uiPriority w:val="9"/>
     <w:qFormat/>
-    <w:rsid w:val="00FE4E72"/>
+    <w:rsid w:val="00AD5FAD"/>
     <w:pPr>
       <w:keepNext/>
       <w:keepLines/>
@@ -1087,7 +1150,7 @@
     </w:pPr>
     <w:rPr>
       <w:rFonts w:asciiTheme="majorHAnsi" w:eastAsiaTheme="majorEastAsia" w:hAnsiTheme="majorHAnsi" w:cstheme="majorBidi"/>
-      <w:color w:val="0F4761" w:themeColor="accent1" w:themeShade="BF"/>
+      <w:color w:val="595959" w:themeColor="text1" w:themeTint="A6"/>
       <w:sz w:val="40"/>
       <w:szCs w:val="40"/>
     </w:rPr>
@@ -1100,7 +1163,7 @@
     <w:uiPriority w:val="9"/>
     <w:unhideWhenUsed/>
     <w:qFormat/>
-    <w:rsid w:val="00FE4E72"/>
+    <w:rsid w:val="00AD5FAD"/>
     <w:pPr>
       <w:keepNext/>
       <w:keepLines/>
@@ -1109,7 +1172,7 @@
     </w:pPr>
     <w:rPr>
       <w:rFonts w:asciiTheme="majorHAnsi" w:eastAsiaTheme="majorEastAsia" w:hAnsiTheme="majorHAnsi" w:cstheme="majorBidi"/>
-      <w:color w:val="0F4761" w:themeColor="accent1" w:themeShade="BF"/>
+      <w:color w:val="595959" w:themeColor="text1" w:themeTint="A6"/>
       <w:sz w:val="32"/>
       <w:szCs w:val="32"/>
     </w:rPr>
@@ -1123,7 +1186,7 @@
     <w:semiHidden/>
     <w:unhideWhenUsed/>
     <w:qFormat/>
-    <w:rsid w:val="00FE4E72"/>
+    <w:rsid w:val="00AD5FAD"/>
     <w:pPr>
       <w:keepNext/>
       <w:keepLines/>
@@ -1132,7 +1195,7 @@
     </w:pPr>
     <w:rPr>
       <w:rFonts w:eastAsiaTheme="majorEastAsia" w:cstheme="majorBidi"/>
-      <w:color w:val="0F4761" w:themeColor="accent1" w:themeShade="BF"/>
+      <w:color w:val="595959" w:themeColor="text1" w:themeTint="A6"/>
       <w:sz w:val="28"/>
       <w:szCs w:val="28"/>
     </w:rPr>
@@ -1301,10 +1364,10 @@
     <w:basedOn w:val="Policepardfaut"/>
     <w:link w:val="Titre1"/>
     <w:uiPriority w:val="9"/>
-    <w:rsid w:val="00FE4E72"/>
+    <w:rsid w:val="00AD5FAD"/>
     <w:rPr>
       <w:rFonts w:asciiTheme="majorHAnsi" w:eastAsiaTheme="majorEastAsia" w:hAnsiTheme="majorHAnsi" w:cstheme="majorBidi"/>
-      <w:color w:val="0F4761" w:themeColor="accent1" w:themeShade="BF"/>
+      <w:color w:val="595959" w:themeColor="text1" w:themeTint="A6"/>
       <w:sz w:val="40"/>
       <w:szCs w:val="40"/>
     </w:rPr>
@@ -1314,10 +1377,10 @@
     <w:basedOn w:val="Policepardfaut"/>
     <w:link w:val="Titre2"/>
     <w:uiPriority w:val="9"/>
-    <w:rsid w:val="00FE4E72"/>
+    <w:rsid w:val="00AD5FAD"/>
     <w:rPr>
       <w:rFonts w:asciiTheme="majorHAnsi" w:eastAsiaTheme="majorEastAsia" w:hAnsiTheme="majorHAnsi" w:cstheme="majorBidi"/>
-      <w:color w:val="0F4761" w:themeColor="accent1" w:themeShade="BF"/>
+      <w:color w:val="595959" w:themeColor="text1" w:themeTint="A6"/>
       <w:sz w:val="32"/>
       <w:szCs w:val="32"/>
     </w:rPr>
@@ -1328,10 +1391,10 @@
     <w:link w:val="Titre3"/>
     <w:uiPriority w:val="9"/>
     <w:semiHidden/>
-    <w:rsid w:val="00FE4E72"/>
+    <w:rsid w:val="00AD5FAD"/>
     <w:rPr>
       <w:rFonts w:eastAsiaTheme="majorEastAsia" w:cstheme="majorBidi"/>
-      <w:color w:val="0F4761" w:themeColor="accent1" w:themeShade="BF"/>
+      <w:color w:val="595959" w:themeColor="text1" w:themeTint="A6"/>
       <w:sz w:val="28"/>
       <w:szCs w:val="28"/>
     </w:rPr>
@@ -1421,16 +1484,17 @@
     <w:link w:val="TitreCar"/>
     <w:uiPriority w:val="10"/>
     <w:qFormat/>
-    <w:rsid w:val="00FE4E72"/>
+    <w:rsid w:val="000A0037"/>
     <w:pPr>
       <w:spacing w:after="80" w:line="240" w:lineRule="auto"/>
       <w:contextualSpacing/>
     </w:pPr>
     <w:rPr>
       <w:rFonts w:asciiTheme="majorHAnsi" w:eastAsiaTheme="majorEastAsia" w:hAnsiTheme="majorHAnsi" w:cstheme="majorBidi"/>
+      <w:b/>
       <w:spacing w:val="-10"/>
       <w:kern w:val="28"/>
-      <w:sz w:val="56"/>
+      <w:sz w:val="96"/>
       <w:szCs w:val="56"/>
     </w:rPr>
   </w:style>
@@ -1439,12 +1503,13 @@
     <w:basedOn w:val="Policepardfaut"/>
     <w:link w:val="Titre"/>
     <w:uiPriority w:val="10"/>
-    <w:rsid w:val="00FE4E72"/>
+    <w:rsid w:val="000A0037"/>
     <w:rPr>
       <w:rFonts w:asciiTheme="majorHAnsi" w:eastAsiaTheme="majorEastAsia" w:hAnsiTheme="majorHAnsi" w:cstheme="majorBidi"/>
+      <w:b/>
       <w:spacing w:val="-10"/>
       <w:kern w:val="28"/>
-      <w:sz w:val="56"/>
+      <w:sz w:val="96"/>
       <w:szCs w:val="56"/>
     </w:rPr>
   </w:style>
@@ -1455,7 +1520,7 @@
     <w:link w:val="Sous-titreCar"/>
     <w:uiPriority w:val="11"/>
     <w:qFormat/>
-    <w:rsid w:val="00FE4E72"/>
+    <w:rsid w:val="000A0037"/>
     <w:pPr>
       <w:numPr>
         <w:ilvl w:val="1"/>
@@ -1463,9 +1528,10 @@
     </w:pPr>
     <w:rPr>
       <w:rFonts w:eastAsiaTheme="majorEastAsia" w:cstheme="majorBidi"/>
+      <w:b/>
       <w:color w:val="595959" w:themeColor="text1" w:themeTint="A6"/>
       <w:spacing w:val="15"/>
-      <w:sz w:val="28"/>
+      <w:sz w:val="40"/>
       <w:szCs w:val="28"/>
     </w:rPr>
   </w:style>
@@ -1474,12 +1540,13 @@
     <w:basedOn w:val="Policepardfaut"/>
     <w:link w:val="Sous-titre"/>
     <w:uiPriority w:val="11"/>
-    <w:rsid w:val="00FE4E72"/>
+    <w:rsid w:val="000A0037"/>
     <w:rPr>
       <w:rFonts w:eastAsiaTheme="majorEastAsia" w:cstheme="majorBidi"/>
+      <w:b/>
       <w:color w:val="595959" w:themeColor="text1" w:themeTint="A6"/>
       <w:spacing w:val="15"/>
-      <w:sz w:val="28"/>
+      <w:sz w:val="40"/>
       <w:szCs w:val="28"/>
     </w:rPr>
   </w:style>
@@ -1964,6 +2031,23 @@
 </file>
 
 <file path=customXml/item1.xml><?xml version="1.0" encoding="utf-8"?>
+<p:properties xmlns:p="http://schemas.microsoft.com/office/2006/metadata/properties" xmlns:xsi="http://www.w3.org/2001/XMLSchema-instance" xmlns:pc="http://schemas.microsoft.com/office/infopath/2007/PartnerControls">
+  <documentManagement>
+    <_activity xmlns="308fd9e7-0be8-44ba-81f3-723628cb95d5" xsi:nil="true"/>
+  </documentManagement>
+</p:properties>
+</file>
+
+<file path=customXml/item2.xml><?xml version="1.0" encoding="utf-8"?>
+<?mso-contentType ?>
+<FormTemplates xmlns="http://schemas.microsoft.com/sharepoint/v3/contenttype/forms">
+  <Display>DocumentLibraryForm</Display>
+  <Edit>DocumentLibraryForm</Edit>
+  <New>DocumentLibraryForm</New>
+</FormTemplates>
+</file>
+
+<file path=customXml/item3.xml><?xml version="1.0" encoding="utf-8"?>
 <ct:contentTypeSchema xmlns:ct="http://schemas.microsoft.com/office/2006/metadata/contentType" xmlns:ma="http://schemas.microsoft.com/office/2006/metadata/properties/metaAttributes" ct:_="" ma:_="" ma:contentTypeName="Document" ma:contentTypeID="0x010100288F302392E73041B6BCE39E03C2BCED" ma:contentTypeVersion="15" ma:contentTypeDescription="Crée un document." ma:contentTypeScope="" ma:versionID="1cf235e546ce90db4c4501e9d290c24f">
   <xsd:schema xmlns:xsd="http://www.w3.org/2001/XMLSchema" xmlns:xs="http://www.w3.org/2001/XMLSchema" xmlns:p="http://schemas.microsoft.com/office/2006/metadata/properties" xmlns:ns3="308fd9e7-0be8-44ba-81f3-723628cb95d5" xmlns:ns4="02e62082-1ed3-4499-b3c5-d63020de9536" targetNamespace="http://schemas.microsoft.com/office/2006/metadata/properties" ma:root="true" ma:fieldsID="47328239e90fec05ec528af41ca73e6c" ns3:_="" ns4:_="">
     <xsd:import namespace="308fd9e7-0be8-44ba-81f3-723628cb95d5"/>
@@ -2196,28 +2280,29 @@
 </ct:contentTypeSchema>
 </file>
 
-<file path=customXml/item2.xml><?xml version="1.0" encoding="utf-8"?>
-<?mso-contentType ?>
-<FormTemplates xmlns="http://schemas.microsoft.com/sharepoint/v3/contenttype/forms">
-  <Display>DocumentLibraryForm</Display>
-  <Edit>DocumentLibraryForm</Edit>
-  <New>DocumentLibraryForm</New>
-</FormTemplates>
-</file>
-
-<file path=customXml/item3.xml><?xml version="1.0" encoding="utf-8"?>
-<p:properties xmlns:p="http://schemas.microsoft.com/office/2006/metadata/properties" xmlns:xsi="http://www.w3.org/2001/XMLSchema-instance" xmlns:pc="http://schemas.microsoft.com/office/infopath/2007/PartnerControls">
-  <documentManagement>
-    <_activity xmlns="308fd9e7-0be8-44ba-81f3-723628cb95d5" xsi:nil="true"/>
-  </documentManagement>
-</p:properties>
-</file>
-
 <file path=customXml/item4.xml><?xml version="1.0" encoding="utf-8"?>
 <b:Sources xmlns:b="http://schemas.openxmlformats.org/officeDocument/2006/bibliography" xmlns="http://schemas.openxmlformats.org/officeDocument/2006/bibliography" SelectedStyle="\APASixthEditionOfficeOnline.xsl" StyleName="APA" Version="6"/>
 </file>
 
 <file path=customXml/itemProps1.xml><?xml version="1.0" encoding="utf-8"?>
+<ds:datastoreItem xmlns:ds="http://schemas.openxmlformats.org/officeDocument/2006/customXml" ds:itemID="{A2F67D70-1D7D-41F5-917E-8D20C262458F}">
+  <ds:schemaRefs>
+    <ds:schemaRef ds:uri="http://schemas.microsoft.com/office/2006/metadata/properties"/>
+    <ds:schemaRef ds:uri="http://schemas.microsoft.com/office/infopath/2007/PartnerControls"/>
+    <ds:schemaRef ds:uri="308fd9e7-0be8-44ba-81f3-723628cb95d5"/>
+  </ds:schemaRefs>
+</ds:datastoreItem>
+</file>
+
+<file path=customXml/itemProps2.xml><?xml version="1.0" encoding="utf-8"?>
+<ds:datastoreItem xmlns:ds="http://schemas.openxmlformats.org/officeDocument/2006/customXml" ds:itemID="{894FF3D7-A3AD-4389-89EC-D084FE70A6B4}">
+  <ds:schemaRefs>
+    <ds:schemaRef ds:uri="http://schemas.microsoft.com/sharepoint/v3/contenttype/forms"/>
+  </ds:schemaRefs>
+</ds:datastoreItem>
+</file>
+
+<file path=customXml/itemProps3.xml><?xml version="1.0" encoding="utf-8"?>
 <ds:datastoreItem xmlns:ds="http://schemas.openxmlformats.org/officeDocument/2006/customXml" ds:itemID="{4694D7C3-DDF8-411A-A9D5-2382FE8DD951}">
   <ds:schemaRefs>
     <ds:schemaRef ds:uri="http://schemas.microsoft.com/office/2006/metadata/contentType"/>
@@ -2236,24 +2321,6 @@
 </ds:datastoreItem>
 </file>
 
-<file path=customXml/itemProps2.xml><?xml version="1.0" encoding="utf-8"?>
-<ds:datastoreItem xmlns:ds="http://schemas.openxmlformats.org/officeDocument/2006/customXml" ds:itemID="{894FF3D7-A3AD-4389-89EC-D084FE70A6B4}">
-  <ds:schemaRefs>
-    <ds:schemaRef ds:uri="http://schemas.microsoft.com/sharepoint/v3/contenttype/forms"/>
-  </ds:schemaRefs>
-</ds:datastoreItem>
-</file>
-
-<file path=customXml/itemProps3.xml><?xml version="1.0" encoding="utf-8"?>
-<ds:datastoreItem xmlns:ds="http://schemas.openxmlformats.org/officeDocument/2006/customXml" ds:itemID="{A2F67D70-1D7D-41F5-917E-8D20C262458F}">
-  <ds:schemaRefs>
-    <ds:schemaRef ds:uri="http://schemas.microsoft.com/office/2006/metadata/properties"/>
-    <ds:schemaRef ds:uri="http://schemas.microsoft.com/office/infopath/2007/PartnerControls"/>
-    <ds:schemaRef ds:uri="308fd9e7-0be8-44ba-81f3-723628cb95d5"/>
-  </ds:schemaRefs>
-</ds:datastoreItem>
-</file>
-
 <file path=customXml/itemProps4.xml><?xml version="1.0" encoding="utf-8"?>
 <ds:datastoreItem xmlns:ds="http://schemas.openxmlformats.org/officeDocument/2006/customXml" ds:itemID="{492A4094-C0CE-4806-A03B-AA967586A57B}">
   <ds:schemaRefs>

</xml_diff>

<commit_message>
feat(début v3): dernières modifications nécessaire avant de commencer à instancier
</commit_message>
<xml_diff>
--- a/doc/P-P_OO-LeoBouzon-TowerDefenseRapport.docx
+++ b/doc/P-P_OO-LeoBouzon-TowerDefenseRapport.docx
@@ -16,16 +16,22 @@
     <w:p>
       <w:pPr>
         <w:pStyle w:val="Sous-titre"/>
-        <w:tabs>
-          <w:tab w:val="left" w:pos="2694"/>
-        </w:tabs>
       </w:pPr>
       <w:r>
-        <w:t>Léo Bouzon</w:t>
+        <w:t>Rapport Projet - I320 OO-</w:t>
+      </w:r>
+      <w:proofErr w:type="spellStart"/>
+      <w:r>
+        <w:t>Them</w:t>
+      </w:r>
+      <w:proofErr w:type="spellEnd"/>
+      <w:r>
+        <w:t>-ALL</w:t>
       </w:r>
     </w:p>
     <w:p>
       <w:pPr>
+        <w:pStyle w:val="Sous-titre"/>
         <w:tabs>
           <w:tab w:val="left" w:pos="2694"/>
         </w:tabs>
@@ -40,6 +46,9 @@
           <w:docGrid w:linePitch="360"/>
         </w:sectPr>
       </w:pPr>
+      <w:r>
+        <w:t>Léo Bouzon</w:t>
+      </w:r>
     </w:p>
     <w:p>
       <w:r>
@@ -477,11 +486,9 @@
       <w:r>
         <w:t xml:space="preserve">réaliser de </w:t>
       </w:r>
-      <w:proofErr w:type="gramStart"/>
-      <w:r>
-        <w:t>l’orienté</w:t>
-      </w:r>
-      <w:proofErr w:type="gramEnd"/>
+      <w:r>
+        <w:t>l’orienter</w:t>
+      </w:r>
       <w:r>
         <w:t>-objet</w:t>
       </w:r>
@@ -518,11 +525,15 @@
       <w:r>
         <w:t xml:space="preserve"> </w:t>
       </w:r>
-      <w:proofErr w:type="spellStart"/>
-      <w:r>
-        <w:t>Defense</w:t>
-      </w:r>
-      <w:proofErr w:type="spellEnd"/>
+      <w:r>
+        <w:t>D</w:t>
+      </w:r>
+      <w:r>
+        <w:t>e</w:t>
+      </w:r>
+      <w:r>
+        <w:t>fense</w:t>
+      </w:r>
       <w:r>
         <w:t>. Malgré la complexité</w:t>
       </w:r>
@@ -708,13 +719,7 @@
       <w:rPr>
         <w:noProof/>
       </w:rPr>
-      <w:t>11.02</w:t>
-    </w:r>
-    <w:r>
-      <w:rPr>
-        <w:noProof/>
-      </w:rPr>
-      <w:t>.2026</w:t>
+      <w:t>11.02.2026</w:t>
     </w:r>
     <w:r>
       <w:fldChar w:fldCharType="end"/>
@@ -2031,23 +2036,10 @@
 </file>
 
 <file path=customXml/item1.xml><?xml version="1.0" encoding="utf-8"?>
-<p:properties xmlns:p="http://schemas.microsoft.com/office/2006/metadata/properties" xmlns:xsi="http://www.w3.org/2001/XMLSchema-instance" xmlns:pc="http://schemas.microsoft.com/office/infopath/2007/PartnerControls">
-  <documentManagement>
-    <_activity xmlns="308fd9e7-0be8-44ba-81f3-723628cb95d5" xsi:nil="true"/>
-  </documentManagement>
-</p:properties>
+<b:Sources xmlns:b="http://schemas.openxmlformats.org/officeDocument/2006/bibliography" xmlns="http://schemas.openxmlformats.org/officeDocument/2006/bibliography" SelectedStyle="\APASixthEditionOfficeOnline.xsl" StyleName="APA" Version="6"/>
 </file>
 
 <file path=customXml/item2.xml><?xml version="1.0" encoding="utf-8"?>
-<?mso-contentType ?>
-<FormTemplates xmlns="http://schemas.microsoft.com/sharepoint/v3/contenttype/forms">
-  <Display>DocumentLibraryForm</Display>
-  <Edit>DocumentLibraryForm</Edit>
-  <New>DocumentLibraryForm</New>
-</FormTemplates>
-</file>
-
-<file path=customXml/item3.xml><?xml version="1.0" encoding="utf-8"?>
 <ct:contentTypeSchema xmlns:ct="http://schemas.microsoft.com/office/2006/metadata/contentType" xmlns:ma="http://schemas.microsoft.com/office/2006/metadata/properties/metaAttributes" ct:_="" ma:_="" ma:contentTypeName="Document" ma:contentTypeID="0x010100288F302392E73041B6BCE39E03C2BCED" ma:contentTypeVersion="15" ma:contentTypeDescription="Crée un document." ma:contentTypeScope="" ma:versionID="1cf235e546ce90db4c4501e9d290c24f">
   <xsd:schema xmlns:xsd="http://www.w3.org/2001/XMLSchema" xmlns:xs="http://www.w3.org/2001/XMLSchema" xmlns:p="http://schemas.microsoft.com/office/2006/metadata/properties" xmlns:ns3="308fd9e7-0be8-44ba-81f3-723628cb95d5" xmlns:ns4="02e62082-1ed3-4499-b3c5-d63020de9536" targetNamespace="http://schemas.microsoft.com/office/2006/metadata/properties" ma:root="true" ma:fieldsID="47328239e90fec05ec528af41ca73e6c" ns3:_="" ns4:_="">
     <xsd:import namespace="308fd9e7-0be8-44ba-81f3-723628cb95d5"/>
@@ -2280,29 +2272,32 @@
 </ct:contentTypeSchema>
 </file>
 
+<file path=customXml/item3.xml><?xml version="1.0" encoding="utf-8"?>
+<?mso-contentType ?>
+<FormTemplates xmlns="http://schemas.microsoft.com/sharepoint/v3/contenttype/forms">
+  <Display>DocumentLibraryForm</Display>
+  <Edit>DocumentLibraryForm</Edit>
+  <New>DocumentLibraryForm</New>
+</FormTemplates>
+</file>
+
 <file path=customXml/item4.xml><?xml version="1.0" encoding="utf-8"?>
-<b:Sources xmlns:b="http://schemas.openxmlformats.org/officeDocument/2006/bibliography" xmlns="http://schemas.openxmlformats.org/officeDocument/2006/bibliography" SelectedStyle="\APASixthEditionOfficeOnline.xsl" StyleName="APA" Version="6"/>
+<p:properties xmlns:p="http://schemas.microsoft.com/office/2006/metadata/properties" xmlns:xsi="http://www.w3.org/2001/XMLSchema-instance" xmlns:pc="http://schemas.microsoft.com/office/infopath/2007/PartnerControls">
+  <documentManagement>
+    <_activity xmlns="308fd9e7-0be8-44ba-81f3-723628cb95d5" xsi:nil="true"/>
+  </documentManagement>
+</p:properties>
 </file>
 
 <file path=customXml/itemProps1.xml><?xml version="1.0" encoding="utf-8"?>
-<ds:datastoreItem xmlns:ds="http://schemas.openxmlformats.org/officeDocument/2006/customXml" ds:itemID="{A2F67D70-1D7D-41F5-917E-8D20C262458F}">
+<ds:datastoreItem xmlns:ds="http://schemas.openxmlformats.org/officeDocument/2006/customXml" ds:itemID="{492A4094-C0CE-4806-A03B-AA967586A57B}">
   <ds:schemaRefs>
-    <ds:schemaRef ds:uri="http://schemas.microsoft.com/office/2006/metadata/properties"/>
-    <ds:schemaRef ds:uri="http://schemas.microsoft.com/office/infopath/2007/PartnerControls"/>
-    <ds:schemaRef ds:uri="308fd9e7-0be8-44ba-81f3-723628cb95d5"/>
+    <ds:schemaRef ds:uri="http://schemas.openxmlformats.org/officeDocument/2006/bibliography"/>
   </ds:schemaRefs>
 </ds:datastoreItem>
 </file>
 
 <file path=customXml/itemProps2.xml><?xml version="1.0" encoding="utf-8"?>
-<ds:datastoreItem xmlns:ds="http://schemas.openxmlformats.org/officeDocument/2006/customXml" ds:itemID="{894FF3D7-A3AD-4389-89EC-D084FE70A6B4}">
-  <ds:schemaRefs>
-    <ds:schemaRef ds:uri="http://schemas.microsoft.com/sharepoint/v3/contenttype/forms"/>
-  </ds:schemaRefs>
-</ds:datastoreItem>
-</file>
-
-<file path=customXml/itemProps3.xml><?xml version="1.0" encoding="utf-8"?>
 <ds:datastoreItem xmlns:ds="http://schemas.openxmlformats.org/officeDocument/2006/customXml" ds:itemID="{4694D7C3-DDF8-411A-A9D5-2382FE8DD951}">
   <ds:schemaRefs>
     <ds:schemaRef ds:uri="http://schemas.microsoft.com/office/2006/metadata/contentType"/>
@@ -2321,10 +2316,20 @@
 </ds:datastoreItem>
 </file>
 
+<file path=customXml/itemProps3.xml><?xml version="1.0" encoding="utf-8"?>
+<ds:datastoreItem xmlns:ds="http://schemas.openxmlformats.org/officeDocument/2006/customXml" ds:itemID="{894FF3D7-A3AD-4389-89EC-D084FE70A6B4}">
+  <ds:schemaRefs>
+    <ds:schemaRef ds:uri="http://schemas.microsoft.com/sharepoint/v3/contenttype/forms"/>
+  </ds:schemaRefs>
+</ds:datastoreItem>
+</file>
+
 <file path=customXml/itemProps4.xml><?xml version="1.0" encoding="utf-8"?>
-<ds:datastoreItem xmlns:ds="http://schemas.openxmlformats.org/officeDocument/2006/customXml" ds:itemID="{492A4094-C0CE-4806-A03B-AA967586A57B}">
+<ds:datastoreItem xmlns:ds="http://schemas.openxmlformats.org/officeDocument/2006/customXml" ds:itemID="{A2F67D70-1D7D-41F5-917E-8D20C262458F}">
   <ds:schemaRefs>
-    <ds:schemaRef ds:uri="http://schemas.openxmlformats.org/officeDocument/2006/bibliography"/>
+    <ds:schemaRef ds:uri="http://schemas.microsoft.com/office/2006/metadata/properties"/>
+    <ds:schemaRef ds:uri="http://schemas.microsoft.com/office/infopath/2007/PartnerControls"/>
+    <ds:schemaRef ds:uri="308fd9e7-0be8-44ba-81f3-723628cb95d5"/>
   </ds:schemaRefs>
 </ds:datastoreItem>
 </file>
</xml_diff>

<commit_message>
feat(remis de la v3 finale): fin de la mise en place de la v3
</commit_message>
<xml_diff>
--- a/doc/P-P_OO-LeoBouzon-TowerDefenseRapport.docx
+++ b/doc/P-P_OO-LeoBouzon-TowerDefenseRapport.docx
@@ -8,25 +8,43 @@
         <w:tabs>
           <w:tab w:val="left" w:pos="2694"/>
         </w:tabs>
-      </w:pPr>
-      <w:r>
+        <w:rPr>
+          <w:lang w:val="en-US"/>
+        </w:rPr>
+      </w:pPr>
+      <w:r>
+        <w:rPr>
+          <w:lang w:val="en-US"/>
+        </w:rPr>
         <w:t xml:space="preserve">TOWER DEFENSE </w:t>
       </w:r>
     </w:p>
     <w:p>
       <w:pPr>
         <w:pStyle w:val="Sous-titre"/>
-      </w:pPr>
-      <w:r>
-        <w:t>Rapport Projet - I320 OO-</w:t>
+        <w:rPr>
+          <w:lang w:val="en-US"/>
+        </w:rPr>
+      </w:pPr>
+      <w:r>
+        <w:rPr>
+          <w:lang w:val="en-US"/>
+        </w:rPr>
+        <w:t xml:space="preserve">Rapport </w:t>
       </w:r>
       <w:proofErr w:type="spellStart"/>
       <w:r>
-        <w:t>Them</w:t>
+        <w:rPr>
+          <w:lang w:val="en-US"/>
+        </w:rPr>
+        <w:t>Projet</w:t>
       </w:r>
       <w:proofErr w:type="spellEnd"/>
       <w:r>
-        <w:t>-ALL</w:t>
+        <w:rPr>
+          <w:lang w:val="en-US"/>
+        </w:rPr>
+        <w:t xml:space="preserve"> - I320 OO-Them-ALL</w:t>
       </w:r>
     </w:p>
     <w:p>
@@ -36,8 +54,8 @@
           <w:tab w:val="left" w:pos="2694"/>
         </w:tabs>
         <w:sectPr>
-          <w:headerReference w:type="default" r:id="rId10"/>
-          <w:footerReference w:type="default" r:id="rId11"/>
+          <w:headerReference w:type="default" r:id="rId11"/>
+          <w:footerReference w:type="default" r:id="rId12"/>
           <w:pgSz w:w="11906" w:h="16838" w:code="9"/>
           <w:pgMar w:top="1418" w:right="1418" w:bottom="1418" w:left="1418" w:header="709" w:footer="709" w:gutter="0"/>
           <w:cols w:space="708"/>
@@ -53,13 +71,17 @@
     <w:p>
       <w:r>
         <w:lastRenderedPageBreak/>
-        <w:t>TABLE DES MATIERE</w:t>
+        <w:t>TABLE DES MATI</w:t>
+      </w:r>
+      <w:r>
+        <w:t>ÈRES</w:t>
       </w:r>
     </w:p>
     <w:p>
       <w:pPr>
         <w:pStyle w:val="TM1"/>
         <w:tabs>
+          <w:tab w:val="left" w:pos="480"/>
           <w:tab w:val="right" w:leader="dot" w:pos="9062"/>
         </w:tabs>
         <w:rPr>
@@ -77,12 +99,27 @@
       <w:r>
         <w:fldChar w:fldCharType="separate"/>
       </w:r>
-      <w:hyperlink w:anchor="_Toc219296502" w:history="1">
+      <w:hyperlink w:anchor="_Toc224293468" w:history="1">
         <w:r>
           <w:rPr>
             <w:rStyle w:val="Lienhypertexte"/>
             <w:noProof/>
           </w:rPr>
+          <w:t>1</w:t>
+        </w:r>
+        <w:r>
+          <w:rPr>
+            <w:rFonts w:eastAsiaTheme="minorEastAsia"/>
+            <w:noProof/>
+            <w:lang w:eastAsia="fr-CH"/>
+          </w:rPr>
+          <w:tab/>
+        </w:r>
+        <w:r>
+          <w:rPr>
+            <w:rStyle w:val="Lienhypertexte"/>
+            <w:noProof/>
+          </w:rPr>
           <w:t>Introduction</w:t>
         </w:r>
         <w:r>
@@ -104,7 +141,7 @@
             <w:noProof/>
             <w:webHidden/>
           </w:rPr>
-          <w:instrText xml:space="preserve"> PAGEREF _Toc219296502 \h </w:instrText>
+          <w:instrText xml:space="preserve"> PAGEREF _Toc224293468 \h </w:instrText>
         </w:r>
         <w:r>
           <w:rPr>
@@ -139,6 +176,7 @@
       <w:pPr>
         <w:pStyle w:val="TM2"/>
         <w:tabs>
+          <w:tab w:val="left" w:pos="960"/>
           <w:tab w:val="right" w:leader="dot" w:pos="9062"/>
         </w:tabs>
         <w:rPr>
@@ -147,12 +185,27 @@
           <w:lang w:eastAsia="fr-CH"/>
         </w:rPr>
       </w:pPr>
-      <w:hyperlink w:anchor="_Toc219296503" w:history="1">
+      <w:hyperlink w:anchor="_Toc224293469" w:history="1">
         <w:r>
           <w:rPr>
             <w:rStyle w:val="Lienhypertexte"/>
             <w:noProof/>
           </w:rPr>
+          <w:t>1.1</w:t>
+        </w:r>
+        <w:r>
+          <w:rPr>
+            <w:rFonts w:eastAsiaTheme="minorEastAsia"/>
+            <w:noProof/>
+            <w:lang w:eastAsia="fr-CH"/>
+          </w:rPr>
+          <w:tab/>
+        </w:r>
+        <w:r>
+          <w:rPr>
+            <w:rStyle w:val="Lienhypertexte"/>
+            <w:noProof/>
+          </w:rPr>
           <w:t>Objectifs pédagogiques</w:t>
         </w:r>
         <w:r>
@@ -174,7 +227,7 @@
             <w:noProof/>
             <w:webHidden/>
           </w:rPr>
-          <w:instrText xml:space="preserve"> PAGEREF _Toc219296503 \h </w:instrText>
+          <w:instrText xml:space="preserve"> PAGEREF _Toc224293469 \h </w:instrText>
         </w:r>
         <w:r>
           <w:rPr>
@@ -209,6 +262,7 @@
       <w:pPr>
         <w:pStyle w:val="TM2"/>
         <w:tabs>
+          <w:tab w:val="left" w:pos="960"/>
           <w:tab w:val="right" w:leader="dot" w:pos="9062"/>
         </w:tabs>
         <w:rPr>
@@ -217,12 +271,27 @@
           <w:lang w:eastAsia="fr-CH"/>
         </w:rPr>
       </w:pPr>
-      <w:hyperlink w:anchor="_Toc219296504" w:history="1">
+      <w:hyperlink w:anchor="_Toc224293470" w:history="1">
         <w:r>
           <w:rPr>
             <w:rStyle w:val="Lienhypertexte"/>
             <w:noProof/>
           </w:rPr>
+          <w:t>1.2</w:t>
+        </w:r>
+        <w:r>
+          <w:rPr>
+            <w:rFonts w:eastAsiaTheme="minorEastAsia"/>
+            <w:noProof/>
+            <w:lang w:eastAsia="fr-CH"/>
+          </w:rPr>
+          <w:tab/>
+        </w:r>
+        <w:r>
+          <w:rPr>
+            <w:rStyle w:val="Lienhypertexte"/>
+            <w:noProof/>
+          </w:rPr>
           <w:t>Choix du contexte/domaine</w:t>
         </w:r>
         <w:r>
@@ -244,7 +313,7 @@
             <w:noProof/>
             <w:webHidden/>
           </w:rPr>
-          <w:instrText xml:space="preserve"> PAGEREF _Toc219296504 \h </w:instrText>
+          <w:instrText xml:space="preserve"> PAGEREF _Toc224293470 \h </w:instrText>
         </w:r>
         <w:r>
           <w:rPr>
@@ -279,6 +348,7 @@
       <w:pPr>
         <w:pStyle w:val="TM1"/>
         <w:tabs>
+          <w:tab w:val="left" w:pos="480"/>
           <w:tab w:val="right" w:leader="dot" w:pos="9062"/>
         </w:tabs>
         <w:rPr>
@@ -287,12 +357,27 @@
           <w:lang w:eastAsia="fr-CH"/>
         </w:rPr>
       </w:pPr>
-      <w:hyperlink w:anchor="_Toc219296505" w:history="1">
+      <w:hyperlink w:anchor="_Toc224293471" w:history="1">
         <w:r>
           <w:rPr>
             <w:rStyle w:val="Lienhypertexte"/>
             <w:noProof/>
           </w:rPr>
+          <w:t>3</w:t>
+        </w:r>
+        <w:r>
+          <w:rPr>
+            <w:rFonts w:eastAsiaTheme="minorEastAsia"/>
+            <w:noProof/>
+            <w:lang w:eastAsia="fr-CH"/>
+          </w:rPr>
+          <w:tab/>
+        </w:r>
+        <w:r>
+          <w:rPr>
+            <w:rStyle w:val="Lienhypertexte"/>
+            <w:noProof/>
+          </w:rPr>
           <w:t>Analyse comparative entre les différentes versions</w:t>
         </w:r>
         <w:r>
@@ -314,7 +399,7 @@
             <w:noProof/>
             <w:webHidden/>
           </w:rPr>
-          <w:instrText xml:space="preserve"> PAGEREF _Toc219296505 \h </w:instrText>
+          <w:instrText xml:space="preserve"> PAGEREF _Toc224293471 \h </w:instrText>
         </w:r>
         <w:r>
           <w:rPr>
@@ -347,8 +432,9 @@
     </w:p>
     <w:p>
       <w:pPr>
-        <w:pStyle w:val="TM1"/>
-        <w:tabs>
+        <w:pStyle w:val="TM2"/>
+        <w:tabs>
+          <w:tab w:val="left" w:pos="960"/>
           <w:tab w:val="right" w:leader="dot" w:pos="9062"/>
         </w:tabs>
         <w:rPr>
@@ -357,12 +443,371 @@
           <w:lang w:eastAsia="fr-CH"/>
         </w:rPr>
       </w:pPr>
-      <w:hyperlink w:anchor="_Toc219296506" w:history="1">
+      <w:hyperlink w:anchor="_Toc224293472" w:history="1">
         <w:r>
           <w:rPr>
             <w:rStyle w:val="Lienhypertexte"/>
             <w:noProof/>
           </w:rPr>
+          <w:t>3.1</w:t>
+        </w:r>
+        <w:r>
+          <w:rPr>
+            <w:rFonts w:eastAsiaTheme="minorEastAsia"/>
+            <w:noProof/>
+            <w:lang w:eastAsia="fr-CH"/>
+          </w:rPr>
+          <w:tab/>
+        </w:r>
+        <w:r>
+          <w:rPr>
+            <w:rStyle w:val="Lienhypertexte"/>
+            <w:noProof/>
+          </w:rPr>
+          <w:t>Version 1 – Approche procédurale</w:t>
+        </w:r>
+        <w:r>
+          <w:rPr>
+            <w:noProof/>
+            <w:webHidden/>
+          </w:rPr>
+          <w:tab/>
+        </w:r>
+        <w:r>
+          <w:rPr>
+            <w:noProof/>
+            <w:webHidden/>
+          </w:rPr>
+          <w:fldChar w:fldCharType="begin"/>
+        </w:r>
+        <w:r>
+          <w:rPr>
+            <w:noProof/>
+            <w:webHidden/>
+          </w:rPr>
+          <w:instrText xml:space="preserve"> PAGEREF _Toc224293472 \h </w:instrText>
+        </w:r>
+        <w:r>
+          <w:rPr>
+            <w:noProof/>
+            <w:webHidden/>
+          </w:rPr>
+        </w:r>
+        <w:r>
+          <w:rPr>
+            <w:noProof/>
+            <w:webHidden/>
+          </w:rPr>
+          <w:fldChar w:fldCharType="separate"/>
+        </w:r>
+        <w:r>
+          <w:rPr>
+            <w:noProof/>
+            <w:webHidden/>
+          </w:rPr>
+          <w:t>2</w:t>
+        </w:r>
+        <w:r>
+          <w:rPr>
+            <w:noProof/>
+            <w:webHidden/>
+          </w:rPr>
+          <w:fldChar w:fldCharType="end"/>
+        </w:r>
+      </w:hyperlink>
+    </w:p>
+    <w:p>
+      <w:pPr>
+        <w:pStyle w:val="TM2"/>
+        <w:tabs>
+          <w:tab w:val="left" w:pos="960"/>
+          <w:tab w:val="right" w:leader="dot" w:pos="9062"/>
+        </w:tabs>
+        <w:rPr>
+          <w:rFonts w:eastAsiaTheme="minorEastAsia"/>
+          <w:noProof/>
+          <w:lang w:eastAsia="fr-CH"/>
+        </w:rPr>
+      </w:pPr>
+      <w:hyperlink w:anchor="_Toc224293473" w:history="1">
+        <w:r>
+          <w:rPr>
+            <w:rStyle w:val="Lienhypertexte"/>
+            <w:noProof/>
+          </w:rPr>
+          <w:t>3.2</w:t>
+        </w:r>
+        <w:r>
+          <w:rPr>
+            <w:rFonts w:eastAsiaTheme="minorEastAsia"/>
+            <w:noProof/>
+            <w:lang w:eastAsia="fr-CH"/>
+          </w:rPr>
+          <w:tab/>
+        </w:r>
+        <w:r>
+          <w:rPr>
+            <w:rStyle w:val="Lienhypertexte"/>
+            <w:noProof/>
+          </w:rPr>
+          <w:t>Version 2 – Organisation modulaire avec classes statiques</w:t>
+        </w:r>
+        <w:r>
+          <w:rPr>
+            <w:noProof/>
+            <w:webHidden/>
+          </w:rPr>
+          <w:tab/>
+        </w:r>
+        <w:r>
+          <w:rPr>
+            <w:noProof/>
+            <w:webHidden/>
+          </w:rPr>
+          <w:fldChar w:fldCharType="begin"/>
+        </w:r>
+        <w:r>
+          <w:rPr>
+            <w:noProof/>
+            <w:webHidden/>
+          </w:rPr>
+          <w:instrText xml:space="preserve"> PAGEREF _Toc224293473 \h </w:instrText>
+        </w:r>
+        <w:r>
+          <w:rPr>
+            <w:noProof/>
+            <w:webHidden/>
+          </w:rPr>
+        </w:r>
+        <w:r>
+          <w:rPr>
+            <w:noProof/>
+            <w:webHidden/>
+          </w:rPr>
+          <w:fldChar w:fldCharType="separate"/>
+        </w:r>
+        <w:r>
+          <w:rPr>
+            <w:noProof/>
+            <w:webHidden/>
+          </w:rPr>
+          <w:t>2</w:t>
+        </w:r>
+        <w:r>
+          <w:rPr>
+            <w:noProof/>
+            <w:webHidden/>
+          </w:rPr>
+          <w:fldChar w:fldCharType="end"/>
+        </w:r>
+      </w:hyperlink>
+    </w:p>
+    <w:p>
+      <w:pPr>
+        <w:pStyle w:val="TM2"/>
+        <w:tabs>
+          <w:tab w:val="left" w:pos="960"/>
+          <w:tab w:val="right" w:leader="dot" w:pos="9062"/>
+        </w:tabs>
+        <w:rPr>
+          <w:rFonts w:eastAsiaTheme="minorEastAsia"/>
+          <w:noProof/>
+          <w:lang w:eastAsia="fr-CH"/>
+        </w:rPr>
+      </w:pPr>
+      <w:hyperlink w:anchor="_Toc224293474" w:history="1">
+        <w:r>
+          <w:rPr>
+            <w:rStyle w:val="Lienhypertexte"/>
+            <w:noProof/>
+          </w:rPr>
+          <w:t>3.3</w:t>
+        </w:r>
+        <w:r>
+          <w:rPr>
+            <w:rFonts w:eastAsiaTheme="minorEastAsia"/>
+            <w:noProof/>
+            <w:lang w:eastAsia="fr-CH"/>
+          </w:rPr>
+          <w:tab/>
+        </w:r>
+        <w:r>
+          <w:rPr>
+            <w:rStyle w:val="Lienhypertexte"/>
+            <w:noProof/>
+          </w:rPr>
+          <w:t>Version 3 – Programmation orientée objet</w:t>
+        </w:r>
+        <w:r>
+          <w:rPr>
+            <w:noProof/>
+            <w:webHidden/>
+          </w:rPr>
+          <w:tab/>
+        </w:r>
+        <w:r>
+          <w:rPr>
+            <w:noProof/>
+            <w:webHidden/>
+          </w:rPr>
+          <w:fldChar w:fldCharType="begin"/>
+        </w:r>
+        <w:r>
+          <w:rPr>
+            <w:noProof/>
+            <w:webHidden/>
+          </w:rPr>
+          <w:instrText xml:space="preserve"> PAGEREF _Toc224293474 \h </w:instrText>
+        </w:r>
+        <w:r>
+          <w:rPr>
+            <w:noProof/>
+            <w:webHidden/>
+          </w:rPr>
+        </w:r>
+        <w:r>
+          <w:rPr>
+            <w:noProof/>
+            <w:webHidden/>
+          </w:rPr>
+          <w:fldChar w:fldCharType="separate"/>
+        </w:r>
+        <w:r>
+          <w:rPr>
+            <w:noProof/>
+            <w:webHidden/>
+          </w:rPr>
+          <w:t>3</w:t>
+        </w:r>
+        <w:r>
+          <w:rPr>
+            <w:noProof/>
+            <w:webHidden/>
+          </w:rPr>
+          <w:fldChar w:fldCharType="end"/>
+        </w:r>
+      </w:hyperlink>
+    </w:p>
+    <w:p>
+      <w:pPr>
+        <w:pStyle w:val="TM2"/>
+        <w:tabs>
+          <w:tab w:val="left" w:pos="960"/>
+          <w:tab w:val="right" w:leader="dot" w:pos="9062"/>
+        </w:tabs>
+        <w:rPr>
+          <w:rFonts w:eastAsiaTheme="minorEastAsia"/>
+          <w:noProof/>
+          <w:lang w:eastAsia="fr-CH"/>
+        </w:rPr>
+      </w:pPr>
+      <w:hyperlink w:anchor="_Toc224293475" w:history="1">
+        <w:r>
+          <w:rPr>
+            <w:rStyle w:val="Lienhypertexte"/>
+            <w:noProof/>
+          </w:rPr>
+          <w:t>3.4</w:t>
+        </w:r>
+        <w:r>
+          <w:rPr>
+            <w:rFonts w:eastAsiaTheme="minorEastAsia"/>
+            <w:noProof/>
+            <w:lang w:eastAsia="fr-CH"/>
+          </w:rPr>
+          <w:tab/>
+        </w:r>
+        <w:r>
+          <w:rPr>
+            <w:rStyle w:val="Lienhypertexte"/>
+            <w:noProof/>
+          </w:rPr>
+          <w:t>Comparaison concrète</w:t>
+        </w:r>
+        <w:r>
+          <w:rPr>
+            <w:noProof/>
+            <w:webHidden/>
+          </w:rPr>
+          <w:tab/>
+        </w:r>
+        <w:r>
+          <w:rPr>
+            <w:noProof/>
+            <w:webHidden/>
+          </w:rPr>
+          <w:fldChar w:fldCharType="begin"/>
+        </w:r>
+        <w:r>
+          <w:rPr>
+            <w:noProof/>
+            <w:webHidden/>
+          </w:rPr>
+          <w:instrText xml:space="preserve"> PAGEREF _Toc224293475 \h </w:instrText>
+        </w:r>
+        <w:r>
+          <w:rPr>
+            <w:noProof/>
+            <w:webHidden/>
+          </w:rPr>
+        </w:r>
+        <w:r>
+          <w:rPr>
+            <w:noProof/>
+            <w:webHidden/>
+          </w:rPr>
+          <w:fldChar w:fldCharType="separate"/>
+        </w:r>
+        <w:r>
+          <w:rPr>
+            <w:noProof/>
+            <w:webHidden/>
+          </w:rPr>
+          <w:t>4</w:t>
+        </w:r>
+        <w:r>
+          <w:rPr>
+            <w:noProof/>
+            <w:webHidden/>
+          </w:rPr>
+          <w:fldChar w:fldCharType="end"/>
+        </w:r>
+      </w:hyperlink>
+    </w:p>
+    <w:p>
+      <w:pPr>
+        <w:pStyle w:val="TM1"/>
+        <w:tabs>
+          <w:tab w:val="left" w:pos="480"/>
+          <w:tab w:val="right" w:leader="dot" w:pos="9062"/>
+        </w:tabs>
+        <w:rPr>
+          <w:rFonts w:eastAsiaTheme="minorEastAsia"/>
+          <w:noProof/>
+          <w:lang w:eastAsia="fr-CH"/>
+        </w:rPr>
+      </w:pPr>
+      <w:hyperlink w:anchor="_Toc224293476" w:history="1">
+        <w:r>
+          <w:rPr>
+            <w:rStyle w:val="Lienhypertexte"/>
+            <w:noProof/>
+          </w:rPr>
+          <w:t>4</w:t>
+        </w:r>
+        <w:r>
+          <w:rPr>
+            <w:rFonts w:eastAsiaTheme="minorEastAsia"/>
+            <w:noProof/>
+            <w:lang w:eastAsia="fr-CH"/>
+          </w:rPr>
+          <w:tab/>
+        </w:r>
+        <w:r>
+          <w:rPr>
+            <w:rStyle w:val="Lienhypertexte"/>
+            <w:noProof/>
+          </w:rPr>
           <w:t>Conclusion</w:t>
         </w:r>
         <w:r>
@@ -384,7 +829,7 @@
             <w:noProof/>
             <w:webHidden/>
           </w:rPr>
-          <w:instrText xml:space="preserve"> PAGEREF _Toc219296506 \h </w:instrText>
+          <w:instrText xml:space="preserve"> PAGEREF _Toc224293476 \h </w:instrText>
         </w:r>
         <w:r>
           <w:rPr>
@@ -404,7 +849,7 @@
             <w:noProof/>
             <w:webHidden/>
           </w:rPr>
-          <w:t>3</w:t>
+          <w:t>5</w:t>
         </w:r>
         <w:r>
           <w:rPr>
@@ -417,9 +862,10 @@
     </w:p>
     <w:p>
       <w:pPr>
+        <w:pStyle w:val="Corpsdetexte"/>
         <w:sectPr>
-          <w:headerReference w:type="first" r:id="rId12"/>
-          <w:footerReference w:type="first" r:id="rId13"/>
+          <w:headerReference w:type="first" r:id="rId13"/>
+          <w:footerReference w:type="first" r:id="rId14"/>
           <w:pgSz w:w="11906" w:h="16838"/>
           <w:pgMar w:top="1417" w:right="1417" w:bottom="1417" w:left="1417" w:header="708" w:footer="708" w:gutter="0"/>
           <w:cols w:space="708"/>
@@ -435,7 +881,7 @@
       <w:pPr>
         <w:pStyle w:val="Titre1"/>
       </w:pPr>
-      <w:bookmarkStart w:id="0" w:name="_Toc219296502"/>
+      <w:bookmarkStart w:id="0" w:name="_Toc224293468"/>
       <w:r>
         <w:lastRenderedPageBreak/>
         <w:t>Introduction</w:t>
@@ -446,7 +892,7 @@
       <w:pPr>
         <w:pStyle w:val="Titre2"/>
       </w:pPr>
-      <w:bookmarkStart w:id="1" w:name="_Toc219296503"/>
+      <w:bookmarkStart w:id="1" w:name="_Toc224293469"/>
       <w:r>
         <w:t>Objectifs pédagogiques</w:t>
       </w:r>
@@ -456,6 +902,9 @@
       </w:r>
     </w:p>
     <w:p>
+      <w:pPr>
+        <w:pStyle w:val="Corpsdetexte"/>
+      </w:pPr>
       <w:r>
         <w:t xml:space="preserve">L’objectif de ce projet est tout d’abord d’apprendre </w:t>
       </w:r>
@@ -466,7 +915,13 @@
         <w:t xml:space="preserve"> un projet en </w:t>
       </w:r>
       <w:r>
-        <w:t>le découpant en plusieurs versions. Nous allons donc réaliser du versioning à l’aide</w:t>
+        <w:t xml:space="preserve">le découpant en plusieurs </w:t>
+      </w:r>
+      <w:r>
+        <w:t>versions</w:t>
+      </w:r>
+      <w:r>
+        <w:t>. Nous allons donc réaliser du versioning à l’aide</w:t>
       </w:r>
       <w:r>
         <w:t xml:space="preserve"> de GitHub</w:t>
@@ -478,7 +933,7 @@
         <w:t xml:space="preserve">sions </w:t>
       </w:r>
       <w:r>
-        <w:t xml:space="preserve">de notre projet qui seront toutes évaluées au fur et à mesures. </w:t>
+        <w:t xml:space="preserve">de notre projet qui seront toutes évaluées au fur et à mesure. </w:t>
       </w:r>
       <w:r>
         <w:t xml:space="preserve">A travers ce projet nous allons également </w:t>
@@ -487,7 +942,10 @@
         <w:t xml:space="preserve">réaliser de </w:t>
       </w:r>
       <w:r>
-        <w:t>l’orienter</w:t>
+        <w:t xml:space="preserve">la programmation </w:t>
+      </w:r>
+      <w:r>
+        <w:t>orienter</w:t>
       </w:r>
       <w:r>
         <w:t>-objet</w:t>
@@ -503,7 +961,7 @@
       <w:pPr>
         <w:pStyle w:val="Titre2"/>
       </w:pPr>
-      <w:bookmarkStart w:id="2" w:name="_Toc219296504"/>
+      <w:bookmarkStart w:id="2" w:name="_Toc224293470"/>
       <w:r>
         <w:t>Choix du contexte</w:t>
       </w:r>
@@ -513,6 +971,9 @@
       <w:bookmarkEnd w:id="2"/>
     </w:p>
     <w:p>
+      <w:pPr>
+        <w:pStyle w:val="Corpsdetexte"/>
+      </w:pPr>
       <w:r>
         <w:t>Parmi les différents thèmes proposés, j</w:t>
       </w:r>
@@ -560,7 +1021,7 @@
       <w:pPr>
         <w:pStyle w:val="Titre1"/>
       </w:pPr>
-      <w:bookmarkStart w:id="3" w:name="_Toc219296505"/>
+      <w:bookmarkStart w:id="3" w:name="_Toc224293471"/>
       <w:r>
         <w:lastRenderedPageBreak/>
         <w:t xml:space="preserve">Analyse comparative </w:t>
@@ -572,23 +1033,615 @@
     </w:p>
     <w:p>
       <w:pPr>
+        <w:pStyle w:val="Titre2"/>
+      </w:pPr>
+      <w:bookmarkStart w:id="4" w:name="_Toc224293472"/>
+      <w:r>
+        <w:t>Version 1 – Approche procédurale</w:t>
+      </w:r>
+      <w:bookmarkEnd w:id="4"/>
+    </w:p>
+    <w:p>
+      <w:pPr>
+        <w:pStyle w:val="Corpsdetexte"/>
+      </w:pPr>
+      <w:r>
+        <w:t xml:space="preserve">La première version du projet a été réalisée avec une approche procédurale. Dans cette version, l’ensemble du programme était </w:t>
+      </w:r>
+      <w:r>
+        <w:t xml:space="preserve">en code </w:t>
+      </w:r>
+      <w:proofErr w:type="spellStart"/>
+      <w:r>
+        <w:t>spagetthi</w:t>
+      </w:r>
+      <w:proofErr w:type="spellEnd"/>
+      <w:r>
+        <w:t xml:space="preserve">, </w:t>
+      </w:r>
+      <w:r>
+        <w:t xml:space="preserve">contenu dans le fichier </w:t>
+      </w:r>
+      <w:proofErr w:type="spellStart"/>
+      <w:r>
+        <w:t>Program.cs</w:t>
+      </w:r>
+      <w:proofErr w:type="spellEnd"/>
+      <w:r>
+        <w:t>, avec plusieurs fonctions permettant de gérer les différentes actions du jeu.</w:t>
+      </w:r>
+    </w:p>
+    <w:p>
+      <w:pPr>
+        <w:pStyle w:val="Corpsdetexte"/>
+      </w:pPr>
+      <w:r>
+        <w:t>Les fonctionnalités principales implémentées étaient notamment :</w:t>
+      </w:r>
+    </w:p>
+    <w:p>
+      <w:pPr>
+        <w:numPr>
+          <w:ilvl w:val="0"/>
+          <w:numId w:val="1"/>
+        </w:numPr>
+      </w:pPr>
+      <w:r>
+        <w:t>Le</w:t>
+      </w:r>
+      <w:r>
+        <w:t xml:space="preserve"> placement des tours</w:t>
+      </w:r>
+    </w:p>
+    <w:p>
+      <w:pPr>
+        <w:numPr>
+          <w:ilvl w:val="0"/>
+          <w:numId w:val="1"/>
+        </w:numPr>
+      </w:pPr>
+      <w:r>
+        <w:t>Le</w:t>
+      </w:r>
+      <w:r>
+        <w:t xml:space="preserve"> déplacement des ennemis</w:t>
+      </w:r>
+    </w:p>
+    <w:p>
+      <w:pPr>
+        <w:numPr>
+          <w:ilvl w:val="0"/>
+          <w:numId w:val="1"/>
+        </w:numPr>
+      </w:pPr>
+      <w:r>
+        <w:t>Le</w:t>
+      </w:r>
+      <w:r>
+        <w:t xml:space="preserve"> tir des tours</w:t>
+      </w:r>
+    </w:p>
+    <w:p>
+      <w:pPr>
+        <w:numPr>
+          <w:ilvl w:val="0"/>
+          <w:numId w:val="1"/>
+        </w:numPr>
+      </w:pPr>
+      <w:r>
+        <w:t>Le</w:t>
+      </w:r>
+      <w:r>
+        <w:t xml:space="preserve"> calcul des dégâts</w:t>
+      </w:r>
+    </w:p>
+    <w:p>
+      <w:pPr>
+        <w:pStyle w:val="Corpsdetexte"/>
+      </w:pPr>
+      <w:r>
+        <w:t>Cette approche permet de rapidement créer un programme fonctionnel, car la logique du jeu est simple à mettre en place. Les algorithmes sont directement écrits dans les fonctions et exécutés dans la boucle principale.</w:t>
+      </w:r>
+    </w:p>
+    <w:p>
+      <w:pPr>
+        <w:pStyle w:val="Corpsdetexte"/>
+      </w:pPr>
+      <w:r>
+        <w:t>Cependant, cette méthode présente plusieurs inconvénients :</w:t>
+      </w:r>
+    </w:p>
+    <w:p>
+      <w:pPr>
+        <w:numPr>
+          <w:ilvl w:val="0"/>
+          <w:numId w:val="2"/>
+        </w:numPr>
+      </w:pPr>
+      <w:r>
+        <w:t>Le</w:t>
+      </w:r>
+      <w:r>
+        <w:t xml:space="preserve"> code devient rapidement difficile à lire lorsque le programme grandit</w:t>
+      </w:r>
+    </w:p>
+    <w:p>
+      <w:pPr>
+        <w:numPr>
+          <w:ilvl w:val="0"/>
+          <w:numId w:val="2"/>
+        </w:numPr>
+      </w:pPr>
+      <w:r>
+        <w:t>Certaines</w:t>
+      </w:r>
+      <w:r>
+        <w:t xml:space="preserve"> parties du code peuvent </w:t>
+      </w:r>
+      <w:r>
+        <w:t>se</w:t>
+      </w:r>
+      <w:r>
+        <w:t xml:space="preserve"> </w:t>
+      </w:r>
+      <w:r>
+        <w:t>répétés</w:t>
+      </w:r>
+    </w:p>
+    <w:p>
+      <w:pPr>
+        <w:numPr>
+          <w:ilvl w:val="0"/>
+          <w:numId w:val="2"/>
+        </w:numPr>
+      </w:pPr>
+      <w:proofErr w:type="gramStart"/>
+      <w:r>
+        <w:t>il</w:t>
+      </w:r>
+      <w:proofErr w:type="gramEnd"/>
+      <w:r>
+        <w:t xml:space="preserve"> est difficile de modifier ou d’ajouter des fonctionnalités sans affecter d’autres parties du programme</w:t>
+      </w:r>
+    </w:p>
+    <w:p>
+      <w:pPr>
+        <w:pStyle w:val="Corpsdetexte"/>
+        <w:pBdr>
+          <w:bottom w:val="double" w:sz="6" w:space="1" w:color="auto"/>
+        </w:pBdr>
+      </w:pPr>
+      <w:r>
+        <w:t>Malgré ces limites, cette version permet de bien comprendre la logique de base du jeu et de poser les fondations du projet.</w:t>
+      </w:r>
+    </w:p>
+    <w:p>
+      <w:pPr>
+        <w:pStyle w:val="Titre2"/>
+      </w:pPr>
+      <w:bookmarkStart w:id="5" w:name="_Toc224293473"/>
+      <w:r>
+        <w:t>Version 2 – Organisation modulaire avec classes statiques</w:t>
+      </w:r>
+      <w:bookmarkEnd w:id="5"/>
+    </w:p>
+    <w:p>
+      <w:pPr>
+        <w:pStyle w:val="Corpsdetexte"/>
+      </w:pPr>
+      <w:r>
+        <w:t xml:space="preserve">Dans la deuxième version, le code a été restructuré en plusieurs classes statiques afin de mieux organiser les </w:t>
+      </w:r>
+      <w:r>
+        <w:t>différentes parties</w:t>
+      </w:r>
+      <w:r>
+        <w:t xml:space="preserve"> du programme.</w:t>
+      </w:r>
+      <w:r>
+        <w:t xml:space="preserve"> On obtient alors des fichiers .cs distincts contenant chacun une fonctionnalité importante du programme</w:t>
+      </w:r>
+    </w:p>
+    <w:p>
+      <w:pPr>
+        <w:pStyle w:val="Corpsdetexte"/>
+      </w:pPr>
+      <w:r>
+        <w:t>L’objectif principal était de séparer les différentes parties du programme,</w:t>
+      </w:r>
+      <w:r>
+        <w:t xml:space="preserve"> notamment</w:t>
+      </w:r>
+      <w:r>
+        <w:t xml:space="preserve"> :</w:t>
+      </w:r>
+    </w:p>
+    <w:p>
+      <w:pPr>
+        <w:numPr>
+          <w:ilvl w:val="0"/>
+          <w:numId w:val="3"/>
+        </w:numPr>
+      </w:pPr>
+      <w:r>
+        <w:t>La g</w:t>
+      </w:r>
+      <w:r>
+        <w:t>estion de l’affichage du jeu</w:t>
+      </w:r>
+    </w:p>
+    <w:p>
+      <w:pPr>
+        <w:numPr>
+          <w:ilvl w:val="0"/>
+          <w:numId w:val="3"/>
+        </w:numPr>
+      </w:pPr>
+      <w:r>
+        <w:t>La g</w:t>
+      </w:r>
+      <w:r>
+        <w:t>estion du placement des tours</w:t>
+      </w:r>
+    </w:p>
+    <w:p>
+      <w:pPr>
+        <w:numPr>
+          <w:ilvl w:val="0"/>
+          <w:numId w:val="3"/>
+        </w:numPr>
+      </w:pPr>
+      <w:r>
+        <w:t>La gestion des projectiles</w:t>
+      </w:r>
+    </w:p>
+    <w:p>
+      <w:pPr>
+        <w:pStyle w:val="Corpsdetexte"/>
+      </w:pPr>
+      <w:r>
+        <w:t>Cette séparation permet d’améliorer la lisibilité du code et de faciliter sa maintenance. Chaque classe possède un rôle précis, ce qui évite de mélanger toutes les fonctionnalités dans un seul fichier.</w:t>
+      </w:r>
+    </w:p>
+    <w:p>
+      <w:pPr>
+        <w:pStyle w:val="Corpsdetexte"/>
+      </w:pPr>
+      <w:r>
+        <w:lastRenderedPageBreak/>
+        <w:t>Cette organisation améliore la structure du programme et permet d’éviter la duplication de code. Cependant, les classes restent statiques, ce qui signifie qu’il n’y a pas encore de véritables objets instanciés dans le programme.</w:t>
+      </w:r>
+    </w:p>
+    <w:p>
+      <w:pPr>
+        <w:pStyle w:val="Corpsdetexte"/>
+        <w:pBdr>
+          <w:bottom w:val="double" w:sz="6" w:space="1" w:color="auto"/>
+        </w:pBdr>
+      </w:pPr>
+      <w:r>
+        <w:t>Cette version constitue donc une transition entre la programmation procédurale et la programmation orientée objet.</w:t>
+      </w:r>
+    </w:p>
+    <w:p>
+      <w:pPr>
+        <w:pStyle w:val="Titre2"/>
+      </w:pPr>
+      <w:bookmarkStart w:id="6" w:name="_Toc224293474"/>
+      <w:r>
+        <w:t>Version 3 – Programmation orientée objet</w:t>
+      </w:r>
+      <w:bookmarkEnd w:id="6"/>
+    </w:p>
+    <w:p>
+      <w:pPr>
+        <w:pStyle w:val="Corpsdetexte"/>
+      </w:pPr>
+      <w:r>
+        <w:t>La troisième version du projet repose entièrement sur les principes de la programmation orientée objet. Le programme est organisé autour de plusieurs classes représentant les différentes entités du jeu</w:t>
+      </w:r>
+      <w:r>
+        <w:t xml:space="preserve"> comme :</w:t>
+      </w:r>
+    </w:p>
+    <w:p>
+      <w:pPr>
+        <w:numPr>
+          <w:ilvl w:val="0"/>
+          <w:numId w:val="5"/>
+        </w:numPr>
+      </w:pPr>
+      <w:r>
+        <w:t>Monster représente les ennemis d</w:t>
+      </w:r>
+      <w:r>
+        <w:t>ans le</w:t>
+      </w:r>
+      <w:r>
+        <w:t xml:space="preserve"> jeu</w:t>
+      </w:r>
+    </w:p>
+    <w:p>
+      <w:pPr>
+        <w:numPr>
+          <w:ilvl w:val="0"/>
+          <w:numId w:val="5"/>
+        </w:numPr>
+      </w:pPr>
+      <w:r>
+        <w:t>Boss hérite de Monster et possède plus de points de vie</w:t>
+      </w:r>
+    </w:p>
+    <w:p>
+      <w:pPr>
+        <w:numPr>
+          <w:ilvl w:val="0"/>
+          <w:numId w:val="5"/>
+        </w:numPr>
+      </w:pPr>
+      <w:proofErr w:type="spellStart"/>
+      <w:r>
+        <w:t>TowerManager</w:t>
+      </w:r>
+      <w:proofErr w:type="spellEnd"/>
+      <w:r>
+        <w:t xml:space="preserve"> gère le placement et les tirs des tours</w:t>
+      </w:r>
+    </w:p>
+    <w:p>
+      <w:pPr>
+        <w:numPr>
+          <w:ilvl w:val="0"/>
+          <w:numId w:val="5"/>
+        </w:numPr>
+      </w:pPr>
+      <w:proofErr w:type="spellStart"/>
+      <w:r>
+        <w:t>PathManager</w:t>
+      </w:r>
+      <w:proofErr w:type="spellEnd"/>
+      <w:r>
+        <w:t xml:space="preserve"> gère le déplacement des ennemis sur le chemin</w:t>
+      </w:r>
+    </w:p>
+    <w:p>
+      <w:pPr>
+        <w:numPr>
+          <w:ilvl w:val="0"/>
+          <w:numId w:val="5"/>
+        </w:numPr>
+      </w:pPr>
+      <w:r>
+        <w:t>Bullet gère l’affichage des projectiles</w:t>
+      </w:r>
+    </w:p>
+    <w:p>
+      <w:pPr>
+        <w:numPr>
+          <w:ilvl w:val="0"/>
+          <w:numId w:val="5"/>
+        </w:numPr>
+      </w:pPr>
+      <w:proofErr w:type="spellStart"/>
+      <w:r>
+        <w:t>WinCondition</w:t>
+      </w:r>
+      <w:proofErr w:type="spellEnd"/>
+      <w:r>
+        <w:t xml:space="preserve"> gère les écrans de victoire et de défaite</w:t>
+      </w:r>
+    </w:p>
+    <w:p>
+      <w:pPr>
+        <w:pStyle w:val="Corpsdetexte"/>
+      </w:pPr>
+      <w:r>
+        <w:t>Chaque classe possède des attributs privés et des méthodes publiques permettant d’assurer l’encapsulation des données.</w:t>
+      </w:r>
+    </w:p>
+    <w:p>
+      <w:pPr>
+        <w:pStyle w:val="Corpsdetexte"/>
+      </w:pPr>
+      <w:r>
+        <w:t>Par exemple, la classe Monster contient des informations comme :</w:t>
+      </w:r>
+    </w:p>
+    <w:p>
+      <w:pPr>
+        <w:numPr>
+          <w:ilvl w:val="0"/>
+          <w:numId w:val="6"/>
+        </w:numPr>
+      </w:pPr>
+      <w:r>
+        <w:t>Les</w:t>
+      </w:r>
+      <w:r>
+        <w:t xml:space="preserve"> points de vie (</w:t>
+      </w:r>
+      <w:proofErr w:type="spellStart"/>
+      <w:r>
+        <w:t>MonsterHP</w:t>
+      </w:r>
+      <w:proofErr w:type="spellEnd"/>
+      <w:r>
+        <w:t>)</w:t>
+      </w:r>
+    </w:p>
+    <w:p>
+      <w:pPr>
+        <w:numPr>
+          <w:ilvl w:val="0"/>
+          <w:numId w:val="6"/>
+        </w:numPr>
+      </w:pPr>
+      <w:r>
+        <w:t>La</w:t>
+      </w:r>
+      <w:r>
+        <w:t xml:space="preserve"> position du monstre</w:t>
+      </w:r>
+    </w:p>
+    <w:p>
+      <w:pPr>
+        <w:numPr>
+          <w:ilvl w:val="0"/>
+          <w:numId w:val="6"/>
+        </w:numPr>
+      </w:pPr>
+      <w:r>
+        <w:t>Sa</w:t>
+      </w:r>
+      <w:r>
+        <w:t xml:space="preserve"> vitesse de déplacement</w:t>
+      </w:r>
+    </w:p>
+    <w:p>
+      <w:pPr>
+        <w:numPr>
+          <w:ilvl w:val="0"/>
+          <w:numId w:val="6"/>
+        </w:numPr>
+      </w:pPr>
+      <w:r>
+        <w:t>Le</w:t>
+      </w:r>
+      <w:r>
+        <w:t xml:space="preserve"> symbole affiché dans la console</w:t>
+      </w:r>
+    </w:p>
+    <w:p>
+      <w:pPr>
+        <w:pStyle w:val="Corpsdetexte"/>
+      </w:pPr>
+      <w:r>
+        <w:t>La classe Boss illustre l’utilisation de l’héritage. Elle hérite de la classe Monster mais possède davantage de points de vie, ce qui permet de créer un ennemi plus puissant sans réécrire toute la logique de base.</w:t>
+      </w:r>
+    </w:p>
+    <w:p>
+      <w:pPr>
+        <w:pStyle w:val="Corpsdetexte"/>
+      </w:pPr>
+      <w:r>
+        <w:t xml:space="preserve">La gestion du jeu est également répartie entre plusieurs objets qui collaborent entre eux. </w:t>
+      </w:r>
+    </w:p>
+    <w:p>
+      <w:pPr>
+        <w:pStyle w:val="Corpsdetexte"/>
+      </w:pPr>
+      <w:r>
+        <w:t>Cette architecture rend le code plus structuré, plus lisible et plus facile à faire évoluer.</w:t>
+      </w:r>
+      <w:r>
+        <w:t xml:space="preserve"> </w:t>
+      </w:r>
+    </w:p>
+    <w:p>
+      <w:r>
+        <w:br w:type="page"/>
+      </w:r>
+    </w:p>
+    <w:p>
+      <w:pPr>
+        <w:pStyle w:val="Titre2"/>
+      </w:pPr>
+      <w:bookmarkStart w:id="7" w:name="_Toc224293475"/>
+      <w:r>
+        <w:lastRenderedPageBreak/>
+        <w:t>Comparaison concrète</w:t>
+      </w:r>
+      <w:bookmarkEnd w:id="7"/>
+    </w:p>
+    <w:p>
+      <w:pPr>
+        <w:pStyle w:val="Corpsdetexte"/>
+      </w:pPr>
+      <w:r>
+        <w:t>Après avoir analysé les trois versions du projet, on peut observer une évolution progressive dans la manière de structurer le code.</w:t>
+      </w:r>
+    </w:p>
+    <w:p>
+      <w:pPr>
+        <w:pStyle w:val="Corpsdetexte"/>
+      </w:pPr>
+      <w:r>
+        <w:t>Entre la version 1 et la version 2, la principale différence est l’introduction de classes permettant de mieux organiser le programme. Cependant, ces classes restent statiques et ne représentent pas encore de véritables objets du jeu.</w:t>
+      </w:r>
+    </w:p>
+    <w:p>
+      <w:pPr>
+        <w:pStyle w:val="Corpsdetexte"/>
+      </w:pPr>
+      <w:r>
+        <w:t>La différence entre la version 2 et la version 3 est l’introduction complète de la programmation orientée objet. Les classes sont mieux structurées et représentent désormais des entités du jeu, comme les ennemis, les tours ou les projectiles. Elles peuvent être instanciées afin de créer plusieurs objets à partir d’une même classe, ce qui rend le programme plus flexible et plus facile à faire évoluer.</w:t>
+      </w:r>
+      <w:r>
+        <w:br w:type="page"/>
+      </w:r>
+    </w:p>
+    <w:p>
+      <w:pPr>
         <w:pStyle w:val="Titre1"/>
       </w:pPr>
-      <w:r>
-        <w:br w:type="page"/>
-      </w:r>
-    </w:p>
-    <w:p>
-      <w:pPr>
-        <w:pStyle w:val="Titre1"/>
-      </w:pPr>
-      <w:bookmarkStart w:id="4" w:name="_Toc219296506"/>
+      <w:bookmarkStart w:id="8" w:name="_Toc224293476"/>
       <w:r>
         <w:lastRenderedPageBreak/>
         <w:t>Conclusion</w:t>
       </w:r>
-      <w:bookmarkEnd w:id="4"/>
-    </w:p>
+      <w:bookmarkEnd w:id="8"/>
+    </w:p>
+    <w:p>
+      <w:r>
+        <w:t>Ce projet m’a permis de découvrir progressivement différentes manières d’organiser un programme.</w:t>
+      </w:r>
+      <w:r>
+        <w:t xml:space="preserve"> Malgré de grosses difficultés à le réaliser. </w:t>
+      </w:r>
+    </w:p>
+    <w:p>
+      <w:r>
+        <w:t xml:space="preserve">La première version procédurale m’a permis de me concentrer sur les algorithmes et la logique du jeu. Elle m’a aidé à </w:t>
+      </w:r>
+      <w:r>
+        <w:t>accroitre mes connaissances en codes et pouvoir m’entrainer à nouveau sur du code.</w:t>
+      </w:r>
+    </w:p>
+    <w:p>
+      <w:r>
+        <w:t xml:space="preserve">La deuxième version m’a </w:t>
+      </w:r>
+      <w:r>
+        <w:t>aidé à comprendre</w:t>
+      </w:r>
+      <w:r>
+        <w:t xml:space="preserve"> à structurer le code en plusieurs </w:t>
+      </w:r>
+      <w:r>
+        <w:t>classes</w:t>
+      </w:r>
+      <w:r>
+        <w:t xml:space="preserve"> afin de séparer les responsabilités et d’améliorer la lisibilité du programme.</w:t>
+      </w:r>
+    </w:p>
+    <w:p>
+      <w:r>
+        <w:t>Enfin, la troisième version m’a permis de mettre en pratique les principes de la programmation orientée objet tels que l’encapsulation, l’instanciation et l’héritage. Grâce à cette approche, le programme devient plus organisé et plus facile à maintenir.</w:t>
+      </w:r>
+      <w:r>
+        <w:t xml:space="preserve"> Il permet également de pouvoir créer plusieurs objets très simplement.</w:t>
+      </w:r>
+    </w:p>
+    <w:p>
+      <w:pPr>
+        <w:pStyle w:val="Corpsdetexte"/>
+      </w:pPr>
+      <w:r>
+        <w:t>Malheureusement mon projet comporte un détail que je ne parviens pas à régler. Lorsque le monstre avance sur le terrain, sa lettre apparaît deux fois. Tout le reste du code fonctionne comme attendu.</w:t>
+      </w:r>
+    </w:p>
+    <w:p/>
     <w:sectPr>
       <w:pgSz w:w="11906" w:h="16838"/>
       <w:pgMar w:top="1417" w:right="1417" w:bottom="1417" w:left="1417" w:header="708" w:footer="708" w:gutter="0"/>
@@ -736,6 +1789,1325 @@
     </w:pPr>
   </w:p>
 </w:hdr>
+</file>
+
+<file path=word/numbering.xml><?xml version="1.0" encoding="utf-8"?>
+<w:numbering xmlns:wpc="http://schemas.microsoft.com/office/word/2010/wordprocessingCanvas" xmlns:cx="http://schemas.microsoft.com/office/drawing/2014/chartex" xmlns:cx1="http://schemas.microsoft.com/office/drawing/2015/9/8/chartex" xmlns:cx2="http://schemas.microsoft.com/office/drawing/2015/10/21/chartex" xmlns:cx3="http://schemas.microsoft.com/office/drawing/2016/5/9/chartex" xmlns:cx4="http://schemas.microsoft.com/office/drawing/2016/5/10/chartex" xmlns:cx5="http://schemas.microsoft.com/office/drawing/2016/5/11/chartex" xmlns:cx6="http://schemas.microsoft.com/office/drawing/2016/5/12/chartex" xmlns:cx7="http://schemas.microsoft.com/office/drawing/2016/5/13/chartex" xmlns:cx8="http://schemas.microsoft.com/office/drawing/2016/5/14/chartex" xmlns:mc="http://schemas.openxmlformats.org/markup-compatibility/2006" xmlns:aink="http://schemas.microsoft.com/office/drawing/2016/ink" xmlns:am3d="http://schemas.microsoft.com/office/drawing/2017/model3d" xmlns:o="urn:schemas-microsoft-com:office:office" xmlns:oel="http://schemas.microsoft.com/office/2019/extlst" xmlns:r="http://schemas.openxmlformats.org/officeDocument/2006/relationships" xmlns:m="http://schemas.openxmlformats.org/officeDocument/2006/math" xmlns:v="urn:schemas-microsoft-com:vml" xmlns:wp14="http://schemas.microsoft.com/office/word/2010/wordprocessingDrawing" xmlns:wp="http://schemas.openxmlformats.org/drawingml/2006/wordprocessingDrawing" xmlns:w10="urn:schemas-microsoft-com:office:word" xmlns:w="http://schemas.openxmlformats.org/wordprocessingml/2006/main" xmlns:w14="http://schemas.microsoft.com/office/word/2010/wordml" xmlns:w15="http://schemas.microsoft.com/office/word/2012/wordml" xmlns:w16cex="http://schemas.microsoft.com/office/word/2018/wordml/cex" xmlns:w16cid="http://schemas.microsoft.com/office/word/2016/wordml/cid" xmlns:w16="http://schemas.microsoft.com/office/word/2018/wordml" xmlns:w16sdtdh="http://schemas.microsoft.com/office/word/2020/wordml/sdtdatahash" xmlns:w16se="http://schemas.microsoft.com/office/word/2015/wordml/symex" xmlns:wpg="http://schemas.microsoft.com/office/word/2010/wordprocessingGroup" xmlns:wpi="http://schemas.microsoft.com/office/word/2010/wordprocessingInk" xmlns:wne="http://schemas.microsoft.com/office/word/2006/wordml" xmlns:wps="http://schemas.microsoft.com/office/word/2010/wordprocessingShape" mc:Ignorable="w14 w15 w16se w16cid w16 w16cex w16sdtdh wp14">
+  <w:abstractNum w:abstractNumId="0" w15:restartNumberingAfterBreak="0">
+    <w:nsid w:val="0EF86802"/>
+    <w:multiLevelType w:val="multilevel"/>
+    <w:tmpl w:val="BF2A1EA0"/>
+    <w:lvl w:ilvl="0">
+      <w:start w:val="1"/>
+      <w:numFmt w:val="bullet"/>
+      <w:lvlText w:val=""/>
+      <w:lvlJc w:val="left"/>
+      <w:pPr>
+        <w:tabs>
+          <w:tab w:val="num" w:pos="720"/>
+        </w:tabs>
+        <w:ind w:left="720" w:hanging="360"/>
+      </w:pPr>
+      <w:rPr>
+        <w:rFonts w:ascii="Symbol" w:hAnsi="Symbol" w:hint="default"/>
+        <w:sz w:val="20"/>
+      </w:rPr>
+    </w:lvl>
+    <w:lvl w:ilvl="1" w:tentative="1">
+      <w:start w:val="1"/>
+      <w:numFmt w:val="bullet"/>
+      <w:lvlText w:val="o"/>
+      <w:lvlJc w:val="left"/>
+      <w:pPr>
+        <w:tabs>
+          <w:tab w:val="num" w:pos="1440"/>
+        </w:tabs>
+        <w:ind w:left="1440" w:hanging="360"/>
+      </w:pPr>
+      <w:rPr>
+        <w:rFonts w:ascii="Courier New" w:hAnsi="Courier New" w:hint="default"/>
+        <w:sz w:val="20"/>
+      </w:rPr>
+    </w:lvl>
+    <w:lvl w:ilvl="2" w:tentative="1">
+      <w:start w:val="1"/>
+      <w:numFmt w:val="bullet"/>
+      <w:lvlText w:val=""/>
+      <w:lvlJc w:val="left"/>
+      <w:pPr>
+        <w:tabs>
+          <w:tab w:val="num" w:pos="2160"/>
+        </w:tabs>
+        <w:ind w:left="2160" w:hanging="360"/>
+      </w:pPr>
+      <w:rPr>
+        <w:rFonts w:ascii="Wingdings" w:hAnsi="Wingdings" w:hint="default"/>
+        <w:sz w:val="20"/>
+      </w:rPr>
+    </w:lvl>
+    <w:lvl w:ilvl="3" w:tentative="1">
+      <w:start w:val="1"/>
+      <w:numFmt w:val="bullet"/>
+      <w:lvlText w:val=""/>
+      <w:lvlJc w:val="left"/>
+      <w:pPr>
+        <w:tabs>
+          <w:tab w:val="num" w:pos="2880"/>
+        </w:tabs>
+        <w:ind w:left="2880" w:hanging="360"/>
+      </w:pPr>
+      <w:rPr>
+        <w:rFonts w:ascii="Wingdings" w:hAnsi="Wingdings" w:hint="default"/>
+        <w:sz w:val="20"/>
+      </w:rPr>
+    </w:lvl>
+    <w:lvl w:ilvl="4" w:tentative="1">
+      <w:start w:val="1"/>
+      <w:numFmt w:val="bullet"/>
+      <w:lvlText w:val=""/>
+      <w:lvlJc w:val="left"/>
+      <w:pPr>
+        <w:tabs>
+          <w:tab w:val="num" w:pos="3600"/>
+        </w:tabs>
+        <w:ind w:left="3600" w:hanging="360"/>
+      </w:pPr>
+      <w:rPr>
+        <w:rFonts w:ascii="Wingdings" w:hAnsi="Wingdings" w:hint="default"/>
+        <w:sz w:val="20"/>
+      </w:rPr>
+    </w:lvl>
+    <w:lvl w:ilvl="5" w:tentative="1">
+      <w:start w:val="1"/>
+      <w:numFmt w:val="bullet"/>
+      <w:lvlText w:val=""/>
+      <w:lvlJc w:val="left"/>
+      <w:pPr>
+        <w:tabs>
+          <w:tab w:val="num" w:pos="4320"/>
+        </w:tabs>
+        <w:ind w:left="4320" w:hanging="360"/>
+      </w:pPr>
+      <w:rPr>
+        <w:rFonts w:ascii="Wingdings" w:hAnsi="Wingdings" w:hint="default"/>
+        <w:sz w:val="20"/>
+      </w:rPr>
+    </w:lvl>
+    <w:lvl w:ilvl="6" w:tentative="1">
+      <w:start w:val="1"/>
+      <w:numFmt w:val="bullet"/>
+      <w:lvlText w:val=""/>
+      <w:lvlJc w:val="left"/>
+      <w:pPr>
+        <w:tabs>
+          <w:tab w:val="num" w:pos="5040"/>
+        </w:tabs>
+        <w:ind w:left="5040" w:hanging="360"/>
+      </w:pPr>
+      <w:rPr>
+        <w:rFonts w:ascii="Wingdings" w:hAnsi="Wingdings" w:hint="default"/>
+        <w:sz w:val="20"/>
+      </w:rPr>
+    </w:lvl>
+    <w:lvl w:ilvl="7" w:tentative="1">
+      <w:start w:val="1"/>
+      <w:numFmt w:val="bullet"/>
+      <w:lvlText w:val=""/>
+      <w:lvlJc w:val="left"/>
+      <w:pPr>
+        <w:tabs>
+          <w:tab w:val="num" w:pos="5760"/>
+        </w:tabs>
+        <w:ind w:left="5760" w:hanging="360"/>
+      </w:pPr>
+      <w:rPr>
+        <w:rFonts w:ascii="Wingdings" w:hAnsi="Wingdings" w:hint="default"/>
+        <w:sz w:val="20"/>
+      </w:rPr>
+    </w:lvl>
+    <w:lvl w:ilvl="8" w:tentative="1">
+      <w:start w:val="1"/>
+      <w:numFmt w:val="bullet"/>
+      <w:lvlText w:val=""/>
+      <w:lvlJc w:val="left"/>
+      <w:pPr>
+        <w:tabs>
+          <w:tab w:val="num" w:pos="6480"/>
+        </w:tabs>
+        <w:ind w:left="6480" w:hanging="360"/>
+      </w:pPr>
+      <w:rPr>
+        <w:rFonts w:ascii="Wingdings" w:hAnsi="Wingdings" w:hint="default"/>
+        <w:sz w:val="20"/>
+      </w:rPr>
+    </w:lvl>
+  </w:abstractNum>
+  <w:abstractNum w:abstractNumId="1" w15:restartNumberingAfterBreak="0">
+    <w:nsid w:val="12755060"/>
+    <w:multiLevelType w:val="multilevel"/>
+    <w:tmpl w:val="6CE6115A"/>
+    <w:lvl w:ilvl="0">
+      <w:start w:val="1"/>
+      <w:numFmt w:val="bullet"/>
+      <w:lvlText w:val=""/>
+      <w:lvlJc w:val="left"/>
+      <w:pPr>
+        <w:tabs>
+          <w:tab w:val="num" w:pos="720"/>
+        </w:tabs>
+        <w:ind w:left="720" w:hanging="360"/>
+      </w:pPr>
+      <w:rPr>
+        <w:rFonts w:ascii="Symbol" w:hAnsi="Symbol" w:hint="default"/>
+        <w:sz w:val="20"/>
+      </w:rPr>
+    </w:lvl>
+    <w:lvl w:ilvl="1" w:tentative="1">
+      <w:start w:val="1"/>
+      <w:numFmt w:val="bullet"/>
+      <w:lvlText w:val="o"/>
+      <w:lvlJc w:val="left"/>
+      <w:pPr>
+        <w:tabs>
+          <w:tab w:val="num" w:pos="1440"/>
+        </w:tabs>
+        <w:ind w:left="1440" w:hanging="360"/>
+      </w:pPr>
+      <w:rPr>
+        <w:rFonts w:ascii="Courier New" w:hAnsi="Courier New" w:hint="default"/>
+        <w:sz w:val="20"/>
+      </w:rPr>
+    </w:lvl>
+    <w:lvl w:ilvl="2" w:tentative="1">
+      <w:start w:val="1"/>
+      <w:numFmt w:val="bullet"/>
+      <w:lvlText w:val=""/>
+      <w:lvlJc w:val="left"/>
+      <w:pPr>
+        <w:tabs>
+          <w:tab w:val="num" w:pos="2160"/>
+        </w:tabs>
+        <w:ind w:left="2160" w:hanging="360"/>
+      </w:pPr>
+      <w:rPr>
+        <w:rFonts w:ascii="Wingdings" w:hAnsi="Wingdings" w:hint="default"/>
+        <w:sz w:val="20"/>
+      </w:rPr>
+    </w:lvl>
+    <w:lvl w:ilvl="3" w:tentative="1">
+      <w:start w:val="1"/>
+      <w:numFmt w:val="bullet"/>
+      <w:lvlText w:val=""/>
+      <w:lvlJc w:val="left"/>
+      <w:pPr>
+        <w:tabs>
+          <w:tab w:val="num" w:pos="2880"/>
+        </w:tabs>
+        <w:ind w:left="2880" w:hanging="360"/>
+      </w:pPr>
+      <w:rPr>
+        <w:rFonts w:ascii="Wingdings" w:hAnsi="Wingdings" w:hint="default"/>
+        <w:sz w:val="20"/>
+      </w:rPr>
+    </w:lvl>
+    <w:lvl w:ilvl="4" w:tentative="1">
+      <w:start w:val="1"/>
+      <w:numFmt w:val="bullet"/>
+      <w:lvlText w:val=""/>
+      <w:lvlJc w:val="left"/>
+      <w:pPr>
+        <w:tabs>
+          <w:tab w:val="num" w:pos="3600"/>
+        </w:tabs>
+        <w:ind w:left="3600" w:hanging="360"/>
+      </w:pPr>
+      <w:rPr>
+        <w:rFonts w:ascii="Wingdings" w:hAnsi="Wingdings" w:hint="default"/>
+        <w:sz w:val="20"/>
+      </w:rPr>
+    </w:lvl>
+    <w:lvl w:ilvl="5" w:tentative="1">
+      <w:start w:val="1"/>
+      <w:numFmt w:val="bullet"/>
+      <w:lvlText w:val=""/>
+      <w:lvlJc w:val="left"/>
+      <w:pPr>
+        <w:tabs>
+          <w:tab w:val="num" w:pos="4320"/>
+        </w:tabs>
+        <w:ind w:left="4320" w:hanging="360"/>
+      </w:pPr>
+      <w:rPr>
+        <w:rFonts w:ascii="Wingdings" w:hAnsi="Wingdings" w:hint="default"/>
+        <w:sz w:val="20"/>
+      </w:rPr>
+    </w:lvl>
+    <w:lvl w:ilvl="6" w:tentative="1">
+      <w:start w:val="1"/>
+      <w:numFmt w:val="bullet"/>
+      <w:lvlText w:val=""/>
+      <w:lvlJc w:val="left"/>
+      <w:pPr>
+        <w:tabs>
+          <w:tab w:val="num" w:pos="5040"/>
+        </w:tabs>
+        <w:ind w:left="5040" w:hanging="360"/>
+      </w:pPr>
+      <w:rPr>
+        <w:rFonts w:ascii="Wingdings" w:hAnsi="Wingdings" w:hint="default"/>
+        <w:sz w:val="20"/>
+      </w:rPr>
+    </w:lvl>
+    <w:lvl w:ilvl="7" w:tentative="1">
+      <w:start w:val="1"/>
+      <w:numFmt w:val="bullet"/>
+      <w:lvlText w:val=""/>
+      <w:lvlJc w:val="left"/>
+      <w:pPr>
+        <w:tabs>
+          <w:tab w:val="num" w:pos="5760"/>
+        </w:tabs>
+        <w:ind w:left="5760" w:hanging="360"/>
+      </w:pPr>
+      <w:rPr>
+        <w:rFonts w:ascii="Wingdings" w:hAnsi="Wingdings" w:hint="default"/>
+        <w:sz w:val="20"/>
+      </w:rPr>
+    </w:lvl>
+    <w:lvl w:ilvl="8" w:tentative="1">
+      <w:start w:val="1"/>
+      <w:numFmt w:val="bullet"/>
+      <w:lvlText w:val=""/>
+      <w:lvlJc w:val="left"/>
+      <w:pPr>
+        <w:tabs>
+          <w:tab w:val="num" w:pos="6480"/>
+        </w:tabs>
+        <w:ind w:left="6480" w:hanging="360"/>
+      </w:pPr>
+      <w:rPr>
+        <w:rFonts w:ascii="Wingdings" w:hAnsi="Wingdings" w:hint="default"/>
+        <w:sz w:val="20"/>
+      </w:rPr>
+    </w:lvl>
+  </w:abstractNum>
+  <w:abstractNum w:abstractNumId="2" w15:restartNumberingAfterBreak="0">
+    <w:nsid w:val="21C36725"/>
+    <w:multiLevelType w:val="multilevel"/>
+    <w:tmpl w:val="7C404B3A"/>
+    <w:lvl w:ilvl="0">
+      <w:start w:val="1"/>
+      <w:numFmt w:val="bullet"/>
+      <w:lvlText w:val=""/>
+      <w:lvlJc w:val="left"/>
+      <w:pPr>
+        <w:tabs>
+          <w:tab w:val="num" w:pos="720"/>
+        </w:tabs>
+        <w:ind w:left="720" w:hanging="360"/>
+      </w:pPr>
+      <w:rPr>
+        <w:rFonts w:ascii="Symbol" w:hAnsi="Symbol" w:hint="default"/>
+        <w:sz w:val="20"/>
+      </w:rPr>
+    </w:lvl>
+    <w:lvl w:ilvl="1" w:tentative="1">
+      <w:start w:val="1"/>
+      <w:numFmt w:val="bullet"/>
+      <w:lvlText w:val="o"/>
+      <w:lvlJc w:val="left"/>
+      <w:pPr>
+        <w:tabs>
+          <w:tab w:val="num" w:pos="1440"/>
+        </w:tabs>
+        <w:ind w:left="1440" w:hanging="360"/>
+      </w:pPr>
+      <w:rPr>
+        <w:rFonts w:ascii="Courier New" w:hAnsi="Courier New" w:hint="default"/>
+        <w:sz w:val="20"/>
+      </w:rPr>
+    </w:lvl>
+    <w:lvl w:ilvl="2" w:tentative="1">
+      <w:start w:val="1"/>
+      <w:numFmt w:val="bullet"/>
+      <w:lvlText w:val=""/>
+      <w:lvlJc w:val="left"/>
+      <w:pPr>
+        <w:tabs>
+          <w:tab w:val="num" w:pos="2160"/>
+        </w:tabs>
+        <w:ind w:left="2160" w:hanging="360"/>
+      </w:pPr>
+      <w:rPr>
+        <w:rFonts w:ascii="Wingdings" w:hAnsi="Wingdings" w:hint="default"/>
+        <w:sz w:val="20"/>
+      </w:rPr>
+    </w:lvl>
+    <w:lvl w:ilvl="3" w:tentative="1">
+      <w:start w:val="1"/>
+      <w:numFmt w:val="bullet"/>
+      <w:lvlText w:val=""/>
+      <w:lvlJc w:val="left"/>
+      <w:pPr>
+        <w:tabs>
+          <w:tab w:val="num" w:pos="2880"/>
+        </w:tabs>
+        <w:ind w:left="2880" w:hanging="360"/>
+      </w:pPr>
+      <w:rPr>
+        <w:rFonts w:ascii="Wingdings" w:hAnsi="Wingdings" w:hint="default"/>
+        <w:sz w:val="20"/>
+      </w:rPr>
+    </w:lvl>
+    <w:lvl w:ilvl="4" w:tentative="1">
+      <w:start w:val="1"/>
+      <w:numFmt w:val="bullet"/>
+      <w:lvlText w:val=""/>
+      <w:lvlJc w:val="left"/>
+      <w:pPr>
+        <w:tabs>
+          <w:tab w:val="num" w:pos="3600"/>
+        </w:tabs>
+        <w:ind w:left="3600" w:hanging="360"/>
+      </w:pPr>
+      <w:rPr>
+        <w:rFonts w:ascii="Wingdings" w:hAnsi="Wingdings" w:hint="default"/>
+        <w:sz w:val="20"/>
+      </w:rPr>
+    </w:lvl>
+    <w:lvl w:ilvl="5" w:tentative="1">
+      <w:start w:val="1"/>
+      <w:numFmt w:val="bullet"/>
+      <w:lvlText w:val=""/>
+      <w:lvlJc w:val="left"/>
+      <w:pPr>
+        <w:tabs>
+          <w:tab w:val="num" w:pos="4320"/>
+        </w:tabs>
+        <w:ind w:left="4320" w:hanging="360"/>
+      </w:pPr>
+      <w:rPr>
+        <w:rFonts w:ascii="Wingdings" w:hAnsi="Wingdings" w:hint="default"/>
+        <w:sz w:val="20"/>
+      </w:rPr>
+    </w:lvl>
+    <w:lvl w:ilvl="6" w:tentative="1">
+      <w:start w:val="1"/>
+      <w:numFmt w:val="bullet"/>
+      <w:lvlText w:val=""/>
+      <w:lvlJc w:val="left"/>
+      <w:pPr>
+        <w:tabs>
+          <w:tab w:val="num" w:pos="5040"/>
+        </w:tabs>
+        <w:ind w:left="5040" w:hanging="360"/>
+      </w:pPr>
+      <w:rPr>
+        <w:rFonts w:ascii="Wingdings" w:hAnsi="Wingdings" w:hint="default"/>
+        <w:sz w:val="20"/>
+      </w:rPr>
+    </w:lvl>
+    <w:lvl w:ilvl="7" w:tentative="1">
+      <w:start w:val="1"/>
+      <w:numFmt w:val="bullet"/>
+      <w:lvlText w:val=""/>
+      <w:lvlJc w:val="left"/>
+      <w:pPr>
+        <w:tabs>
+          <w:tab w:val="num" w:pos="5760"/>
+        </w:tabs>
+        <w:ind w:left="5760" w:hanging="360"/>
+      </w:pPr>
+      <w:rPr>
+        <w:rFonts w:ascii="Wingdings" w:hAnsi="Wingdings" w:hint="default"/>
+        <w:sz w:val="20"/>
+      </w:rPr>
+    </w:lvl>
+    <w:lvl w:ilvl="8" w:tentative="1">
+      <w:start w:val="1"/>
+      <w:numFmt w:val="bullet"/>
+      <w:lvlText w:val=""/>
+      <w:lvlJc w:val="left"/>
+      <w:pPr>
+        <w:tabs>
+          <w:tab w:val="num" w:pos="6480"/>
+        </w:tabs>
+        <w:ind w:left="6480" w:hanging="360"/>
+      </w:pPr>
+      <w:rPr>
+        <w:rFonts w:ascii="Wingdings" w:hAnsi="Wingdings" w:hint="default"/>
+        <w:sz w:val="20"/>
+      </w:rPr>
+    </w:lvl>
+  </w:abstractNum>
+  <w:abstractNum w:abstractNumId="3" w15:restartNumberingAfterBreak="0">
+    <w:nsid w:val="263F6FFA"/>
+    <w:multiLevelType w:val="multilevel"/>
+    <w:tmpl w:val="100C0025"/>
+    <w:lvl w:ilvl="0">
+      <w:start w:val="1"/>
+      <w:numFmt w:val="decimal"/>
+      <w:pStyle w:val="Titre1"/>
+      <w:lvlText w:val="%1"/>
+      <w:lvlJc w:val="left"/>
+      <w:pPr>
+        <w:ind w:left="432" w:hanging="432"/>
+      </w:pPr>
+    </w:lvl>
+    <w:lvl w:ilvl="1">
+      <w:start w:val="1"/>
+      <w:numFmt w:val="decimal"/>
+      <w:pStyle w:val="Titre2"/>
+      <w:lvlText w:val="%1.%2"/>
+      <w:lvlJc w:val="left"/>
+      <w:pPr>
+        <w:ind w:left="576" w:hanging="576"/>
+      </w:pPr>
+    </w:lvl>
+    <w:lvl w:ilvl="2">
+      <w:start w:val="1"/>
+      <w:numFmt w:val="decimal"/>
+      <w:pStyle w:val="Titre3"/>
+      <w:lvlText w:val="%1.%2.%3"/>
+      <w:lvlJc w:val="left"/>
+      <w:pPr>
+        <w:ind w:left="720" w:hanging="720"/>
+      </w:pPr>
+    </w:lvl>
+    <w:lvl w:ilvl="3">
+      <w:start w:val="1"/>
+      <w:numFmt w:val="decimal"/>
+      <w:pStyle w:val="Titre4"/>
+      <w:lvlText w:val="%1.%2.%3.%4"/>
+      <w:lvlJc w:val="left"/>
+      <w:pPr>
+        <w:ind w:left="864" w:hanging="864"/>
+      </w:pPr>
+    </w:lvl>
+    <w:lvl w:ilvl="4">
+      <w:start w:val="1"/>
+      <w:numFmt w:val="decimal"/>
+      <w:pStyle w:val="Titre5"/>
+      <w:lvlText w:val="%1.%2.%3.%4.%5"/>
+      <w:lvlJc w:val="left"/>
+      <w:pPr>
+        <w:ind w:left="1008" w:hanging="1008"/>
+      </w:pPr>
+    </w:lvl>
+    <w:lvl w:ilvl="5">
+      <w:start w:val="1"/>
+      <w:numFmt w:val="decimal"/>
+      <w:pStyle w:val="Titre6"/>
+      <w:lvlText w:val="%1.%2.%3.%4.%5.%6"/>
+      <w:lvlJc w:val="left"/>
+      <w:pPr>
+        <w:ind w:left="1152" w:hanging="1152"/>
+      </w:pPr>
+    </w:lvl>
+    <w:lvl w:ilvl="6">
+      <w:start w:val="1"/>
+      <w:numFmt w:val="decimal"/>
+      <w:pStyle w:val="Titre7"/>
+      <w:lvlText w:val="%1.%2.%3.%4.%5.%6.%7"/>
+      <w:lvlJc w:val="left"/>
+      <w:pPr>
+        <w:ind w:left="1296" w:hanging="1296"/>
+      </w:pPr>
+    </w:lvl>
+    <w:lvl w:ilvl="7">
+      <w:start w:val="1"/>
+      <w:numFmt w:val="decimal"/>
+      <w:pStyle w:val="Titre8"/>
+      <w:lvlText w:val="%1.%2.%3.%4.%5.%6.%7.%8"/>
+      <w:lvlJc w:val="left"/>
+      <w:pPr>
+        <w:ind w:left="1440" w:hanging="1440"/>
+      </w:pPr>
+    </w:lvl>
+    <w:lvl w:ilvl="8">
+      <w:start w:val="1"/>
+      <w:numFmt w:val="decimal"/>
+      <w:pStyle w:val="Titre9"/>
+      <w:lvlText w:val="%1.%2.%3.%4.%5.%6.%7.%8.%9"/>
+      <w:lvlJc w:val="left"/>
+      <w:pPr>
+        <w:ind w:left="1584" w:hanging="1584"/>
+      </w:pPr>
+    </w:lvl>
+  </w:abstractNum>
+  <w:abstractNum w:abstractNumId="4" w15:restartNumberingAfterBreak="0">
+    <w:nsid w:val="2A177EC5"/>
+    <w:multiLevelType w:val="multilevel"/>
+    <w:tmpl w:val="2C52C15C"/>
+    <w:lvl w:ilvl="0">
+      <w:start w:val="1"/>
+      <w:numFmt w:val="bullet"/>
+      <w:lvlText w:val=""/>
+      <w:lvlJc w:val="left"/>
+      <w:pPr>
+        <w:tabs>
+          <w:tab w:val="num" w:pos="720"/>
+        </w:tabs>
+        <w:ind w:left="720" w:hanging="360"/>
+      </w:pPr>
+      <w:rPr>
+        <w:rFonts w:ascii="Symbol" w:hAnsi="Symbol" w:hint="default"/>
+        <w:sz w:val="20"/>
+      </w:rPr>
+    </w:lvl>
+    <w:lvl w:ilvl="1" w:tentative="1">
+      <w:start w:val="1"/>
+      <w:numFmt w:val="bullet"/>
+      <w:lvlText w:val="o"/>
+      <w:lvlJc w:val="left"/>
+      <w:pPr>
+        <w:tabs>
+          <w:tab w:val="num" w:pos="1440"/>
+        </w:tabs>
+        <w:ind w:left="1440" w:hanging="360"/>
+      </w:pPr>
+      <w:rPr>
+        <w:rFonts w:ascii="Courier New" w:hAnsi="Courier New" w:hint="default"/>
+        <w:sz w:val="20"/>
+      </w:rPr>
+    </w:lvl>
+    <w:lvl w:ilvl="2" w:tentative="1">
+      <w:start w:val="1"/>
+      <w:numFmt w:val="bullet"/>
+      <w:lvlText w:val=""/>
+      <w:lvlJc w:val="left"/>
+      <w:pPr>
+        <w:tabs>
+          <w:tab w:val="num" w:pos="2160"/>
+        </w:tabs>
+        <w:ind w:left="2160" w:hanging="360"/>
+      </w:pPr>
+      <w:rPr>
+        <w:rFonts w:ascii="Wingdings" w:hAnsi="Wingdings" w:hint="default"/>
+        <w:sz w:val="20"/>
+      </w:rPr>
+    </w:lvl>
+    <w:lvl w:ilvl="3" w:tentative="1">
+      <w:start w:val="1"/>
+      <w:numFmt w:val="bullet"/>
+      <w:lvlText w:val=""/>
+      <w:lvlJc w:val="left"/>
+      <w:pPr>
+        <w:tabs>
+          <w:tab w:val="num" w:pos="2880"/>
+        </w:tabs>
+        <w:ind w:left="2880" w:hanging="360"/>
+      </w:pPr>
+      <w:rPr>
+        <w:rFonts w:ascii="Wingdings" w:hAnsi="Wingdings" w:hint="default"/>
+        <w:sz w:val="20"/>
+      </w:rPr>
+    </w:lvl>
+    <w:lvl w:ilvl="4" w:tentative="1">
+      <w:start w:val="1"/>
+      <w:numFmt w:val="bullet"/>
+      <w:lvlText w:val=""/>
+      <w:lvlJc w:val="left"/>
+      <w:pPr>
+        <w:tabs>
+          <w:tab w:val="num" w:pos="3600"/>
+        </w:tabs>
+        <w:ind w:left="3600" w:hanging="360"/>
+      </w:pPr>
+      <w:rPr>
+        <w:rFonts w:ascii="Wingdings" w:hAnsi="Wingdings" w:hint="default"/>
+        <w:sz w:val="20"/>
+      </w:rPr>
+    </w:lvl>
+    <w:lvl w:ilvl="5" w:tentative="1">
+      <w:start w:val="1"/>
+      <w:numFmt w:val="bullet"/>
+      <w:lvlText w:val=""/>
+      <w:lvlJc w:val="left"/>
+      <w:pPr>
+        <w:tabs>
+          <w:tab w:val="num" w:pos="4320"/>
+        </w:tabs>
+        <w:ind w:left="4320" w:hanging="360"/>
+      </w:pPr>
+      <w:rPr>
+        <w:rFonts w:ascii="Wingdings" w:hAnsi="Wingdings" w:hint="default"/>
+        <w:sz w:val="20"/>
+      </w:rPr>
+    </w:lvl>
+    <w:lvl w:ilvl="6" w:tentative="1">
+      <w:start w:val="1"/>
+      <w:numFmt w:val="bullet"/>
+      <w:lvlText w:val=""/>
+      <w:lvlJc w:val="left"/>
+      <w:pPr>
+        <w:tabs>
+          <w:tab w:val="num" w:pos="5040"/>
+        </w:tabs>
+        <w:ind w:left="5040" w:hanging="360"/>
+      </w:pPr>
+      <w:rPr>
+        <w:rFonts w:ascii="Wingdings" w:hAnsi="Wingdings" w:hint="default"/>
+        <w:sz w:val="20"/>
+      </w:rPr>
+    </w:lvl>
+    <w:lvl w:ilvl="7" w:tentative="1">
+      <w:start w:val="1"/>
+      <w:numFmt w:val="bullet"/>
+      <w:lvlText w:val=""/>
+      <w:lvlJc w:val="left"/>
+      <w:pPr>
+        <w:tabs>
+          <w:tab w:val="num" w:pos="5760"/>
+        </w:tabs>
+        <w:ind w:left="5760" w:hanging="360"/>
+      </w:pPr>
+      <w:rPr>
+        <w:rFonts w:ascii="Wingdings" w:hAnsi="Wingdings" w:hint="default"/>
+        <w:sz w:val="20"/>
+      </w:rPr>
+    </w:lvl>
+    <w:lvl w:ilvl="8" w:tentative="1">
+      <w:start w:val="1"/>
+      <w:numFmt w:val="bullet"/>
+      <w:lvlText w:val=""/>
+      <w:lvlJc w:val="left"/>
+      <w:pPr>
+        <w:tabs>
+          <w:tab w:val="num" w:pos="6480"/>
+        </w:tabs>
+        <w:ind w:left="6480" w:hanging="360"/>
+      </w:pPr>
+      <w:rPr>
+        <w:rFonts w:ascii="Wingdings" w:hAnsi="Wingdings" w:hint="default"/>
+        <w:sz w:val="20"/>
+      </w:rPr>
+    </w:lvl>
+  </w:abstractNum>
+  <w:abstractNum w:abstractNumId="5" w15:restartNumberingAfterBreak="0">
+    <w:nsid w:val="40F81960"/>
+    <w:multiLevelType w:val="multilevel"/>
+    <w:tmpl w:val="7D5835DC"/>
+    <w:lvl w:ilvl="0">
+      <w:start w:val="1"/>
+      <w:numFmt w:val="bullet"/>
+      <w:lvlText w:val=""/>
+      <w:lvlJc w:val="left"/>
+      <w:pPr>
+        <w:tabs>
+          <w:tab w:val="num" w:pos="720"/>
+        </w:tabs>
+        <w:ind w:left="720" w:hanging="360"/>
+      </w:pPr>
+      <w:rPr>
+        <w:rFonts w:ascii="Symbol" w:hAnsi="Symbol" w:hint="default"/>
+        <w:sz w:val="20"/>
+      </w:rPr>
+    </w:lvl>
+    <w:lvl w:ilvl="1" w:tentative="1">
+      <w:start w:val="1"/>
+      <w:numFmt w:val="bullet"/>
+      <w:lvlText w:val="o"/>
+      <w:lvlJc w:val="left"/>
+      <w:pPr>
+        <w:tabs>
+          <w:tab w:val="num" w:pos="1440"/>
+        </w:tabs>
+        <w:ind w:left="1440" w:hanging="360"/>
+      </w:pPr>
+      <w:rPr>
+        <w:rFonts w:ascii="Courier New" w:hAnsi="Courier New" w:hint="default"/>
+        <w:sz w:val="20"/>
+      </w:rPr>
+    </w:lvl>
+    <w:lvl w:ilvl="2" w:tentative="1">
+      <w:start w:val="1"/>
+      <w:numFmt w:val="bullet"/>
+      <w:lvlText w:val=""/>
+      <w:lvlJc w:val="left"/>
+      <w:pPr>
+        <w:tabs>
+          <w:tab w:val="num" w:pos="2160"/>
+        </w:tabs>
+        <w:ind w:left="2160" w:hanging="360"/>
+      </w:pPr>
+      <w:rPr>
+        <w:rFonts w:ascii="Wingdings" w:hAnsi="Wingdings" w:hint="default"/>
+        <w:sz w:val="20"/>
+      </w:rPr>
+    </w:lvl>
+    <w:lvl w:ilvl="3" w:tentative="1">
+      <w:start w:val="1"/>
+      <w:numFmt w:val="bullet"/>
+      <w:lvlText w:val=""/>
+      <w:lvlJc w:val="left"/>
+      <w:pPr>
+        <w:tabs>
+          <w:tab w:val="num" w:pos="2880"/>
+        </w:tabs>
+        <w:ind w:left="2880" w:hanging="360"/>
+      </w:pPr>
+      <w:rPr>
+        <w:rFonts w:ascii="Wingdings" w:hAnsi="Wingdings" w:hint="default"/>
+        <w:sz w:val="20"/>
+      </w:rPr>
+    </w:lvl>
+    <w:lvl w:ilvl="4" w:tentative="1">
+      <w:start w:val="1"/>
+      <w:numFmt w:val="bullet"/>
+      <w:lvlText w:val=""/>
+      <w:lvlJc w:val="left"/>
+      <w:pPr>
+        <w:tabs>
+          <w:tab w:val="num" w:pos="3600"/>
+        </w:tabs>
+        <w:ind w:left="3600" w:hanging="360"/>
+      </w:pPr>
+      <w:rPr>
+        <w:rFonts w:ascii="Wingdings" w:hAnsi="Wingdings" w:hint="default"/>
+        <w:sz w:val="20"/>
+      </w:rPr>
+    </w:lvl>
+    <w:lvl w:ilvl="5" w:tentative="1">
+      <w:start w:val="1"/>
+      <w:numFmt w:val="bullet"/>
+      <w:lvlText w:val=""/>
+      <w:lvlJc w:val="left"/>
+      <w:pPr>
+        <w:tabs>
+          <w:tab w:val="num" w:pos="4320"/>
+        </w:tabs>
+        <w:ind w:left="4320" w:hanging="360"/>
+      </w:pPr>
+      <w:rPr>
+        <w:rFonts w:ascii="Wingdings" w:hAnsi="Wingdings" w:hint="default"/>
+        <w:sz w:val="20"/>
+      </w:rPr>
+    </w:lvl>
+    <w:lvl w:ilvl="6" w:tentative="1">
+      <w:start w:val="1"/>
+      <w:numFmt w:val="bullet"/>
+      <w:lvlText w:val=""/>
+      <w:lvlJc w:val="left"/>
+      <w:pPr>
+        <w:tabs>
+          <w:tab w:val="num" w:pos="5040"/>
+        </w:tabs>
+        <w:ind w:left="5040" w:hanging="360"/>
+      </w:pPr>
+      <w:rPr>
+        <w:rFonts w:ascii="Wingdings" w:hAnsi="Wingdings" w:hint="default"/>
+        <w:sz w:val="20"/>
+      </w:rPr>
+    </w:lvl>
+    <w:lvl w:ilvl="7" w:tentative="1">
+      <w:start w:val="1"/>
+      <w:numFmt w:val="bullet"/>
+      <w:lvlText w:val=""/>
+      <w:lvlJc w:val="left"/>
+      <w:pPr>
+        <w:tabs>
+          <w:tab w:val="num" w:pos="5760"/>
+        </w:tabs>
+        <w:ind w:left="5760" w:hanging="360"/>
+      </w:pPr>
+      <w:rPr>
+        <w:rFonts w:ascii="Wingdings" w:hAnsi="Wingdings" w:hint="default"/>
+        <w:sz w:val="20"/>
+      </w:rPr>
+    </w:lvl>
+    <w:lvl w:ilvl="8" w:tentative="1">
+      <w:start w:val="1"/>
+      <w:numFmt w:val="bullet"/>
+      <w:lvlText w:val=""/>
+      <w:lvlJc w:val="left"/>
+      <w:pPr>
+        <w:tabs>
+          <w:tab w:val="num" w:pos="6480"/>
+        </w:tabs>
+        <w:ind w:left="6480" w:hanging="360"/>
+      </w:pPr>
+      <w:rPr>
+        <w:rFonts w:ascii="Wingdings" w:hAnsi="Wingdings" w:hint="default"/>
+        <w:sz w:val="20"/>
+      </w:rPr>
+    </w:lvl>
+  </w:abstractNum>
+  <w:abstractNum w:abstractNumId="6" w15:restartNumberingAfterBreak="0">
+    <w:nsid w:val="41D36D68"/>
+    <w:multiLevelType w:val="multilevel"/>
+    <w:tmpl w:val="114CD446"/>
+    <w:lvl w:ilvl="0">
+      <w:start w:val="1"/>
+      <w:numFmt w:val="bullet"/>
+      <w:lvlText w:val=""/>
+      <w:lvlJc w:val="left"/>
+      <w:pPr>
+        <w:tabs>
+          <w:tab w:val="num" w:pos="720"/>
+        </w:tabs>
+        <w:ind w:left="720" w:hanging="360"/>
+      </w:pPr>
+      <w:rPr>
+        <w:rFonts w:ascii="Symbol" w:hAnsi="Symbol" w:hint="default"/>
+        <w:sz w:val="20"/>
+      </w:rPr>
+    </w:lvl>
+    <w:lvl w:ilvl="1" w:tentative="1">
+      <w:start w:val="1"/>
+      <w:numFmt w:val="bullet"/>
+      <w:lvlText w:val="o"/>
+      <w:lvlJc w:val="left"/>
+      <w:pPr>
+        <w:tabs>
+          <w:tab w:val="num" w:pos="1440"/>
+        </w:tabs>
+        <w:ind w:left="1440" w:hanging="360"/>
+      </w:pPr>
+      <w:rPr>
+        <w:rFonts w:ascii="Courier New" w:hAnsi="Courier New" w:hint="default"/>
+        <w:sz w:val="20"/>
+      </w:rPr>
+    </w:lvl>
+    <w:lvl w:ilvl="2" w:tentative="1">
+      <w:start w:val="1"/>
+      <w:numFmt w:val="bullet"/>
+      <w:lvlText w:val=""/>
+      <w:lvlJc w:val="left"/>
+      <w:pPr>
+        <w:tabs>
+          <w:tab w:val="num" w:pos="2160"/>
+        </w:tabs>
+        <w:ind w:left="2160" w:hanging="360"/>
+      </w:pPr>
+      <w:rPr>
+        <w:rFonts w:ascii="Wingdings" w:hAnsi="Wingdings" w:hint="default"/>
+        <w:sz w:val="20"/>
+      </w:rPr>
+    </w:lvl>
+    <w:lvl w:ilvl="3" w:tentative="1">
+      <w:start w:val="1"/>
+      <w:numFmt w:val="bullet"/>
+      <w:lvlText w:val=""/>
+      <w:lvlJc w:val="left"/>
+      <w:pPr>
+        <w:tabs>
+          <w:tab w:val="num" w:pos="2880"/>
+        </w:tabs>
+        <w:ind w:left="2880" w:hanging="360"/>
+      </w:pPr>
+      <w:rPr>
+        <w:rFonts w:ascii="Wingdings" w:hAnsi="Wingdings" w:hint="default"/>
+        <w:sz w:val="20"/>
+      </w:rPr>
+    </w:lvl>
+    <w:lvl w:ilvl="4" w:tentative="1">
+      <w:start w:val="1"/>
+      <w:numFmt w:val="bullet"/>
+      <w:lvlText w:val=""/>
+      <w:lvlJc w:val="left"/>
+      <w:pPr>
+        <w:tabs>
+          <w:tab w:val="num" w:pos="3600"/>
+        </w:tabs>
+        <w:ind w:left="3600" w:hanging="360"/>
+      </w:pPr>
+      <w:rPr>
+        <w:rFonts w:ascii="Wingdings" w:hAnsi="Wingdings" w:hint="default"/>
+        <w:sz w:val="20"/>
+      </w:rPr>
+    </w:lvl>
+    <w:lvl w:ilvl="5" w:tentative="1">
+      <w:start w:val="1"/>
+      <w:numFmt w:val="bullet"/>
+      <w:lvlText w:val=""/>
+      <w:lvlJc w:val="left"/>
+      <w:pPr>
+        <w:tabs>
+          <w:tab w:val="num" w:pos="4320"/>
+        </w:tabs>
+        <w:ind w:left="4320" w:hanging="360"/>
+      </w:pPr>
+      <w:rPr>
+        <w:rFonts w:ascii="Wingdings" w:hAnsi="Wingdings" w:hint="default"/>
+        <w:sz w:val="20"/>
+      </w:rPr>
+    </w:lvl>
+    <w:lvl w:ilvl="6" w:tentative="1">
+      <w:start w:val="1"/>
+      <w:numFmt w:val="bullet"/>
+      <w:lvlText w:val=""/>
+      <w:lvlJc w:val="left"/>
+      <w:pPr>
+        <w:tabs>
+          <w:tab w:val="num" w:pos="5040"/>
+        </w:tabs>
+        <w:ind w:left="5040" w:hanging="360"/>
+      </w:pPr>
+      <w:rPr>
+        <w:rFonts w:ascii="Wingdings" w:hAnsi="Wingdings" w:hint="default"/>
+        <w:sz w:val="20"/>
+      </w:rPr>
+    </w:lvl>
+    <w:lvl w:ilvl="7" w:tentative="1">
+      <w:start w:val="1"/>
+      <w:numFmt w:val="bullet"/>
+      <w:lvlText w:val=""/>
+      <w:lvlJc w:val="left"/>
+      <w:pPr>
+        <w:tabs>
+          <w:tab w:val="num" w:pos="5760"/>
+        </w:tabs>
+        <w:ind w:left="5760" w:hanging="360"/>
+      </w:pPr>
+      <w:rPr>
+        <w:rFonts w:ascii="Wingdings" w:hAnsi="Wingdings" w:hint="default"/>
+        <w:sz w:val="20"/>
+      </w:rPr>
+    </w:lvl>
+    <w:lvl w:ilvl="8" w:tentative="1">
+      <w:start w:val="1"/>
+      <w:numFmt w:val="bullet"/>
+      <w:lvlText w:val=""/>
+      <w:lvlJc w:val="left"/>
+      <w:pPr>
+        <w:tabs>
+          <w:tab w:val="num" w:pos="6480"/>
+        </w:tabs>
+        <w:ind w:left="6480" w:hanging="360"/>
+      </w:pPr>
+      <w:rPr>
+        <w:rFonts w:ascii="Wingdings" w:hAnsi="Wingdings" w:hint="default"/>
+        <w:sz w:val="20"/>
+      </w:rPr>
+    </w:lvl>
+  </w:abstractNum>
+  <w:abstractNum w:abstractNumId="7" w15:restartNumberingAfterBreak="0">
+    <w:nsid w:val="4E69541D"/>
+    <w:multiLevelType w:val="multilevel"/>
+    <w:tmpl w:val="6804D528"/>
+    <w:lvl w:ilvl="0">
+      <w:start w:val="1"/>
+      <w:numFmt w:val="bullet"/>
+      <w:lvlText w:val=""/>
+      <w:lvlJc w:val="left"/>
+      <w:pPr>
+        <w:tabs>
+          <w:tab w:val="num" w:pos="720"/>
+        </w:tabs>
+        <w:ind w:left="720" w:hanging="360"/>
+      </w:pPr>
+      <w:rPr>
+        <w:rFonts w:ascii="Symbol" w:hAnsi="Symbol" w:hint="default"/>
+        <w:sz w:val="20"/>
+      </w:rPr>
+    </w:lvl>
+    <w:lvl w:ilvl="1" w:tentative="1">
+      <w:start w:val="1"/>
+      <w:numFmt w:val="bullet"/>
+      <w:lvlText w:val="o"/>
+      <w:lvlJc w:val="left"/>
+      <w:pPr>
+        <w:tabs>
+          <w:tab w:val="num" w:pos="1440"/>
+        </w:tabs>
+        <w:ind w:left="1440" w:hanging="360"/>
+      </w:pPr>
+      <w:rPr>
+        <w:rFonts w:ascii="Courier New" w:hAnsi="Courier New" w:hint="default"/>
+        <w:sz w:val="20"/>
+      </w:rPr>
+    </w:lvl>
+    <w:lvl w:ilvl="2" w:tentative="1">
+      <w:start w:val="1"/>
+      <w:numFmt w:val="bullet"/>
+      <w:lvlText w:val=""/>
+      <w:lvlJc w:val="left"/>
+      <w:pPr>
+        <w:tabs>
+          <w:tab w:val="num" w:pos="2160"/>
+        </w:tabs>
+        <w:ind w:left="2160" w:hanging="360"/>
+      </w:pPr>
+      <w:rPr>
+        <w:rFonts w:ascii="Wingdings" w:hAnsi="Wingdings" w:hint="default"/>
+        <w:sz w:val="20"/>
+      </w:rPr>
+    </w:lvl>
+    <w:lvl w:ilvl="3" w:tentative="1">
+      <w:start w:val="1"/>
+      <w:numFmt w:val="bullet"/>
+      <w:lvlText w:val=""/>
+      <w:lvlJc w:val="left"/>
+      <w:pPr>
+        <w:tabs>
+          <w:tab w:val="num" w:pos="2880"/>
+        </w:tabs>
+        <w:ind w:left="2880" w:hanging="360"/>
+      </w:pPr>
+      <w:rPr>
+        <w:rFonts w:ascii="Wingdings" w:hAnsi="Wingdings" w:hint="default"/>
+        <w:sz w:val="20"/>
+      </w:rPr>
+    </w:lvl>
+    <w:lvl w:ilvl="4" w:tentative="1">
+      <w:start w:val="1"/>
+      <w:numFmt w:val="bullet"/>
+      <w:lvlText w:val=""/>
+      <w:lvlJc w:val="left"/>
+      <w:pPr>
+        <w:tabs>
+          <w:tab w:val="num" w:pos="3600"/>
+        </w:tabs>
+        <w:ind w:left="3600" w:hanging="360"/>
+      </w:pPr>
+      <w:rPr>
+        <w:rFonts w:ascii="Wingdings" w:hAnsi="Wingdings" w:hint="default"/>
+        <w:sz w:val="20"/>
+      </w:rPr>
+    </w:lvl>
+    <w:lvl w:ilvl="5" w:tentative="1">
+      <w:start w:val="1"/>
+      <w:numFmt w:val="bullet"/>
+      <w:lvlText w:val=""/>
+      <w:lvlJc w:val="left"/>
+      <w:pPr>
+        <w:tabs>
+          <w:tab w:val="num" w:pos="4320"/>
+        </w:tabs>
+        <w:ind w:left="4320" w:hanging="360"/>
+      </w:pPr>
+      <w:rPr>
+        <w:rFonts w:ascii="Wingdings" w:hAnsi="Wingdings" w:hint="default"/>
+        <w:sz w:val="20"/>
+      </w:rPr>
+    </w:lvl>
+    <w:lvl w:ilvl="6" w:tentative="1">
+      <w:start w:val="1"/>
+      <w:numFmt w:val="bullet"/>
+      <w:lvlText w:val=""/>
+      <w:lvlJc w:val="left"/>
+      <w:pPr>
+        <w:tabs>
+          <w:tab w:val="num" w:pos="5040"/>
+        </w:tabs>
+        <w:ind w:left="5040" w:hanging="360"/>
+      </w:pPr>
+      <w:rPr>
+        <w:rFonts w:ascii="Wingdings" w:hAnsi="Wingdings" w:hint="default"/>
+        <w:sz w:val="20"/>
+      </w:rPr>
+    </w:lvl>
+    <w:lvl w:ilvl="7" w:tentative="1">
+      <w:start w:val="1"/>
+      <w:numFmt w:val="bullet"/>
+      <w:lvlText w:val=""/>
+      <w:lvlJc w:val="left"/>
+      <w:pPr>
+        <w:tabs>
+          <w:tab w:val="num" w:pos="5760"/>
+        </w:tabs>
+        <w:ind w:left="5760" w:hanging="360"/>
+      </w:pPr>
+      <w:rPr>
+        <w:rFonts w:ascii="Wingdings" w:hAnsi="Wingdings" w:hint="default"/>
+        <w:sz w:val="20"/>
+      </w:rPr>
+    </w:lvl>
+    <w:lvl w:ilvl="8" w:tentative="1">
+      <w:start w:val="1"/>
+      <w:numFmt w:val="bullet"/>
+      <w:lvlText w:val=""/>
+      <w:lvlJc w:val="left"/>
+      <w:pPr>
+        <w:tabs>
+          <w:tab w:val="num" w:pos="6480"/>
+        </w:tabs>
+        <w:ind w:left="6480" w:hanging="360"/>
+      </w:pPr>
+      <w:rPr>
+        <w:rFonts w:ascii="Wingdings" w:hAnsi="Wingdings" w:hint="default"/>
+        <w:sz w:val="20"/>
+      </w:rPr>
+    </w:lvl>
+  </w:abstractNum>
+  <w:abstractNum w:abstractNumId="8" w15:restartNumberingAfterBreak="0">
+    <w:nsid w:val="659D7209"/>
+    <w:multiLevelType w:val="multilevel"/>
+    <w:tmpl w:val="4D6A6B60"/>
+    <w:lvl w:ilvl="0">
+      <w:start w:val="1"/>
+      <w:numFmt w:val="bullet"/>
+      <w:lvlText w:val=""/>
+      <w:lvlJc w:val="left"/>
+      <w:pPr>
+        <w:tabs>
+          <w:tab w:val="num" w:pos="720"/>
+        </w:tabs>
+        <w:ind w:left="720" w:hanging="360"/>
+      </w:pPr>
+      <w:rPr>
+        <w:rFonts w:ascii="Symbol" w:hAnsi="Symbol" w:hint="default"/>
+        <w:sz w:val="20"/>
+      </w:rPr>
+    </w:lvl>
+    <w:lvl w:ilvl="1" w:tentative="1">
+      <w:start w:val="1"/>
+      <w:numFmt w:val="bullet"/>
+      <w:lvlText w:val="o"/>
+      <w:lvlJc w:val="left"/>
+      <w:pPr>
+        <w:tabs>
+          <w:tab w:val="num" w:pos="1440"/>
+        </w:tabs>
+        <w:ind w:left="1440" w:hanging="360"/>
+      </w:pPr>
+      <w:rPr>
+        <w:rFonts w:ascii="Courier New" w:hAnsi="Courier New" w:hint="default"/>
+        <w:sz w:val="20"/>
+      </w:rPr>
+    </w:lvl>
+    <w:lvl w:ilvl="2" w:tentative="1">
+      <w:start w:val="1"/>
+      <w:numFmt w:val="bullet"/>
+      <w:lvlText w:val=""/>
+      <w:lvlJc w:val="left"/>
+      <w:pPr>
+        <w:tabs>
+          <w:tab w:val="num" w:pos="2160"/>
+        </w:tabs>
+        <w:ind w:left="2160" w:hanging="360"/>
+      </w:pPr>
+      <w:rPr>
+        <w:rFonts w:ascii="Wingdings" w:hAnsi="Wingdings" w:hint="default"/>
+        <w:sz w:val="20"/>
+      </w:rPr>
+    </w:lvl>
+    <w:lvl w:ilvl="3" w:tentative="1">
+      <w:start w:val="1"/>
+      <w:numFmt w:val="bullet"/>
+      <w:lvlText w:val=""/>
+      <w:lvlJc w:val="left"/>
+      <w:pPr>
+        <w:tabs>
+          <w:tab w:val="num" w:pos="2880"/>
+        </w:tabs>
+        <w:ind w:left="2880" w:hanging="360"/>
+      </w:pPr>
+      <w:rPr>
+        <w:rFonts w:ascii="Wingdings" w:hAnsi="Wingdings" w:hint="default"/>
+        <w:sz w:val="20"/>
+      </w:rPr>
+    </w:lvl>
+    <w:lvl w:ilvl="4" w:tentative="1">
+      <w:start w:val="1"/>
+      <w:numFmt w:val="bullet"/>
+      <w:lvlText w:val=""/>
+      <w:lvlJc w:val="left"/>
+      <w:pPr>
+        <w:tabs>
+          <w:tab w:val="num" w:pos="3600"/>
+        </w:tabs>
+        <w:ind w:left="3600" w:hanging="360"/>
+      </w:pPr>
+      <w:rPr>
+        <w:rFonts w:ascii="Wingdings" w:hAnsi="Wingdings" w:hint="default"/>
+        <w:sz w:val="20"/>
+      </w:rPr>
+    </w:lvl>
+    <w:lvl w:ilvl="5" w:tentative="1">
+      <w:start w:val="1"/>
+      <w:numFmt w:val="bullet"/>
+      <w:lvlText w:val=""/>
+      <w:lvlJc w:val="left"/>
+      <w:pPr>
+        <w:tabs>
+          <w:tab w:val="num" w:pos="4320"/>
+        </w:tabs>
+        <w:ind w:left="4320" w:hanging="360"/>
+      </w:pPr>
+      <w:rPr>
+        <w:rFonts w:ascii="Wingdings" w:hAnsi="Wingdings" w:hint="default"/>
+        <w:sz w:val="20"/>
+      </w:rPr>
+    </w:lvl>
+    <w:lvl w:ilvl="6" w:tentative="1">
+      <w:start w:val="1"/>
+      <w:numFmt w:val="bullet"/>
+      <w:lvlText w:val=""/>
+      <w:lvlJc w:val="left"/>
+      <w:pPr>
+        <w:tabs>
+          <w:tab w:val="num" w:pos="5040"/>
+        </w:tabs>
+        <w:ind w:left="5040" w:hanging="360"/>
+      </w:pPr>
+      <w:rPr>
+        <w:rFonts w:ascii="Wingdings" w:hAnsi="Wingdings" w:hint="default"/>
+        <w:sz w:val="20"/>
+      </w:rPr>
+    </w:lvl>
+    <w:lvl w:ilvl="7" w:tentative="1">
+      <w:start w:val="1"/>
+      <w:numFmt w:val="bullet"/>
+      <w:lvlText w:val=""/>
+      <w:lvlJc w:val="left"/>
+      <w:pPr>
+        <w:tabs>
+          <w:tab w:val="num" w:pos="5760"/>
+        </w:tabs>
+        <w:ind w:left="5760" w:hanging="360"/>
+      </w:pPr>
+      <w:rPr>
+        <w:rFonts w:ascii="Wingdings" w:hAnsi="Wingdings" w:hint="default"/>
+        <w:sz w:val="20"/>
+      </w:rPr>
+    </w:lvl>
+    <w:lvl w:ilvl="8" w:tentative="1">
+      <w:start w:val="1"/>
+      <w:numFmt w:val="bullet"/>
+      <w:lvlText w:val=""/>
+      <w:lvlJc w:val="left"/>
+      <w:pPr>
+        <w:tabs>
+          <w:tab w:val="num" w:pos="6480"/>
+        </w:tabs>
+        <w:ind w:left="6480" w:hanging="360"/>
+      </w:pPr>
+      <w:rPr>
+        <w:rFonts w:ascii="Wingdings" w:hAnsi="Wingdings" w:hint="default"/>
+        <w:sz w:val="20"/>
+      </w:rPr>
+    </w:lvl>
+  </w:abstractNum>
+  <w:num w:numId="1" w16cid:durableId="1999386288">
+    <w:abstractNumId w:val="7"/>
+  </w:num>
+  <w:num w:numId="2" w16cid:durableId="1336107246">
+    <w:abstractNumId w:val="5"/>
+  </w:num>
+  <w:num w:numId="3" w16cid:durableId="1762293087">
+    <w:abstractNumId w:val="8"/>
+  </w:num>
+  <w:num w:numId="4" w16cid:durableId="312875643">
+    <w:abstractNumId w:val="0"/>
+  </w:num>
+  <w:num w:numId="5" w16cid:durableId="1954170288">
+    <w:abstractNumId w:val="1"/>
+  </w:num>
+  <w:num w:numId="6" w16cid:durableId="853494506">
+    <w:abstractNumId w:val="2"/>
+  </w:num>
+  <w:num w:numId="7" w16cid:durableId="1018847824">
+    <w:abstractNumId w:val="4"/>
+  </w:num>
+  <w:num w:numId="8" w16cid:durableId="407121031">
+    <w:abstractNumId w:val="6"/>
+  </w:num>
+  <w:num w:numId="9" w16cid:durableId="6176716">
+    <w:abstractNumId w:val="3"/>
+  </w:num>
+</w:numbering>
 </file>
 
 <file path=word/styles.xml><?xml version="1.0" encoding="utf-8"?>
@@ -1138,6 +3510,7 @@
   <w:style w:type="paragraph" w:default="1" w:styleId="Normal">
     <w:name w:val="Normal"/>
     <w:qFormat/>
+    <w:rsid w:val="00FB46B2"/>
   </w:style>
   <w:style w:type="paragraph" w:styleId="Titre1">
     <w:name w:val="heading 1"/>
@@ -1150,6 +3523,9 @@
     <w:pPr>
       <w:keepNext/>
       <w:keepLines/>
+      <w:numPr>
+        <w:numId w:val="9"/>
+      </w:numPr>
       <w:spacing w:before="360" w:after="80"/>
       <w:outlineLvl w:val="0"/>
     </w:pPr>
@@ -1172,6 +3548,10 @@
     <w:pPr>
       <w:keepNext/>
       <w:keepLines/>
+      <w:numPr>
+        <w:ilvl w:val="1"/>
+        <w:numId w:val="9"/>
+      </w:numPr>
       <w:spacing w:before="160" w:after="80"/>
       <w:outlineLvl w:val="1"/>
     </w:pPr>
@@ -1195,6 +3575,10 @@
     <w:pPr>
       <w:keepNext/>
       <w:keepLines/>
+      <w:numPr>
+        <w:ilvl w:val="2"/>
+        <w:numId w:val="9"/>
+      </w:numPr>
       <w:spacing w:before="160" w:after="80"/>
       <w:outlineLvl w:val="2"/>
     </w:pPr>
@@ -1218,6 +3602,10 @@
     <w:pPr>
       <w:keepNext/>
       <w:keepLines/>
+      <w:numPr>
+        <w:ilvl w:val="3"/>
+        <w:numId w:val="9"/>
+      </w:numPr>
       <w:spacing w:before="80" w:after="40"/>
       <w:outlineLvl w:val="3"/>
     </w:pPr>
@@ -1241,6 +3629,10 @@
     <w:pPr>
       <w:keepNext/>
       <w:keepLines/>
+      <w:numPr>
+        <w:ilvl w:val="4"/>
+        <w:numId w:val="9"/>
+      </w:numPr>
       <w:spacing w:before="80" w:after="40"/>
       <w:outlineLvl w:val="4"/>
     </w:pPr>
@@ -1262,6 +3654,10 @@
     <w:pPr>
       <w:keepNext/>
       <w:keepLines/>
+      <w:numPr>
+        <w:ilvl w:val="5"/>
+        <w:numId w:val="9"/>
+      </w:numPr>
       <w:spacing w:before="40" w:after="0"/>
       <w:outlineLvl w:val="5"/>
     </w:pPr>
@@ -1285,6 +3681,10 @@
     <w:pPr>
       <w:keepNext/>
       <w:keepLines/>
+      <w:numPr>
+        <w:ilvl w:val="6"/>
+        <w:numId w:val="9"/>
+      </w:numPr>
       <w:spacing w:before="40" w:after="0"/>
       <w:outlineLvl w:val="6"/>
     </w:pPr>
@@ -1306,6 +3706,10 @@
     <w:pPr>
       <w:keepNext/>
       <w:keepLines/>
+      <w:numPr>
+        <w:ilvl w:val="7"/>
+        <w:numId w:val="9"/>
+      </w:numPr>
       <w:spacing w:after="0"/>
       <w:outlineLvl w:val="7"/>
     </w:pPr>
@@ -1329,6 +3733,10 @@
     <w:pPr>
       <w:keepNext/>
       <w:keepLines/>
+      <w:numPr>
+        <w:ilvl w:val="8"/>
+        <w:numId w:val="9"/>
+      </w:numPr>
       <w:spacing w:after="0"/>
       <w:outlineLvl w:val="8"/>
     </w:pPr>
@@ -1340,7 +3748,6 @@
   <w:style w:type="character" w:default="1" w:styleId="Policepardfaut">
     <w:name w:val="Default Paragraph Font"/>
     <w:uiPriority w:val="1"/>
-    <w:semiHidden/>
     <w:unhideWhenUsed/>
   </w:style>
   <w:style w:type="table" w:default="1" w:styleId="TableauNormal">
@@ -1737,6 +4144,31 @@
       <w:ind w:left="240"/>
     </w:pPr>
   </w:style>
+  <w:style w:type="paragraph" w:styleId="Corpsdetexte">
+    <w:name w:val="Body Text"/>
+    <w:basedOn w:val="Normal"/>
+    <w:link w:val="CorpsdetexteCar"/>
+    <w:uiPriority w:val="99"/>
+    <w:unhideWhenUsed/>
+    <w:rsid w:val="00FB46B2"/>
+    <w:pPr>
+      <w:spacing w:after="120"/>
+      <w:jc w:val="both"/>
+    </w:pPr>
+  </w:style>
+  <w:style w:type="character" w:customStyle="1" w:styleId="CorpsdetexteCar">
+    <w:name w:val="Corps de texte Car"/>
+    <w:basedOn w:val="Policepardfaut"/>
+    <w:link w:val="Corpsdetexte"/>
+    <w:uiPriority w:val="99"/>
+    <w:rsid w:val="00FB46B2"/>
+  </w:style>
+  <w:style w:type="paragraph" w:customStyle="1" w:styleId="TM">
+    <w:name w:val="TM"/>
+    <w:basedOn w:val="Titre1"/>
+    <w:qFormat/>
+    <w:rsid w:val="00636DC2"/>
+  </w:style>
 </w:styles>
 </file>
 
@@ -2036,10 +4468,23 @@
 </file>
 
 <file path=customXml/item1.xml><?xml version="1.0" encoding="utf-8"?>
-<b:Sources xmlns:b="http://schemas.openxmlformats.org/officeDocument/2006/bibliography" xmlns="http://schemas.openxmlformats.org/officeDocument/2006/bibliography" SelectedStyle="\APASixthEditionOfficeOnline.xsl" StyleName="APA" Version="6"/>
+<p:properties xmlns:p="http://schemas.microsoft.com/office/2006/metadata/properties" xmlns:xsi="http://www.w3.org/2001/XMLSchema-instance" xmlns:pc="http://schemas.microsoft.com/office/infopath/2007/PartnerControls">
+  <documentManagement>
+    <_activity xmlns="308fd9e7-0be8-44ba-81f3-723628cb95d5" xsi:nil="true"/>
+  </documentManagement>
+</p:properties>
 </file>
 
 <file path=customXml/item2.xml><?xml version="1.0" encoding="utf-8"?>
+<?mso-contentType ?>
+<FormTemplates xmlns="http://schemas.microsoft.com/sharepoint/v3/contenttype/forms">
+  <Display>DocumentLibraryForm</Display>
+  <Edit>DocumentLibraryForm</Edit>
+  <New>DocumentLibraryForm</New>
+</FormTemplates>
+</file>
+
+<file path=customXml/item3.xml><?xml version="1.0" encoding="utf-8"?>
 <ct:contentTypeSchema xmlns:ct="http://schemas.microsoft.com/office/2006/metadata/contentType" xmlns:ma="http://schemas.microsoft.com/office/2006/metadata/properties/metaAttributes" ct:_="" ma:_="" ma:contentTypeName="Document" ma:contentTypeID="0x010100288F302392E73041B6BCE39E03C2BCED" ma:contentTypeVersion="15" ma:contentTypeDescription="Crée un document." ma:contentTypeScope="" ma:versionID="1cf235e546ce90db4c4501e9d290c24f">
   <xsd:schema xmlns:xsd="http://www.w3.org/2001/XMLSchema" xmlns:xs="http://www.w3.org/2001/XMLSchema" xmlns:p="http://schemas.microsoft.com/office/2006/metadata/properties" xmlns:ns3="308fd9e7-0be8-44ba-81f3-723628cb95d5" xmlns:ns4="02e62082-1ed3-4499-b3c5-d63020de9536" targetNamespace="http://schemas.microsoft.com/office/2006/metadata/properties" ma:root="true" ma:fieldsID="47328239e90fec05ec528af41ca73e6c" ns3:_="" ns4:_="">
     <xsd:import namespace="308fd9e7-0be8-44ba-81f3-723628cb95d5"/>
@@ -2272,32 +4717,29 @@
 </ct:contentTypeSchema>
 </file>
 
-<file path=customXml/item3.xml><?xml version="1.0" encoding="utf-8"?>
-<?mso-contentType ?>
-<FormTemplates xmlns="http://schemas.microsoft.com/sharepoint/v3/contenttype/forms">
-  <Display>DocumentLibraryForm</Display>
-  <Edit>DocumentLibraryForm</Edit>
-  <New>DocumentLibraryForm</New>
-</FormTemplates>
-</file>
-
 <file path=customXml/item4.xml><?xml version="1.0" encoding="utf-8"?>
-<p:properties xmlns:p="http://schemas.microsoft.com/office/2006/metadata/properties" xmlns:xsi="http://www.w3.org/2001/XMLSchema-instance" xmlns:pc="http://schemas.microsoft.com/office/infopath/2007/PartnerControls">
-  <documentManagement>
-    <_activity xmlns="308fd9e7-0be8-44ba-81f3-723628cb95d5" xsi:nil="true"/>
-  </documentManagement>
-</p:properties>
+<b:Sources xmlns:b="http://schemas.openxmlformats.org/officeDocument/2006/bibliography" xmlns="http://schemas.openxmlformats.org/officeDocument/2006/bibliography" SelectedStyle="\APASixthEditionOfficeOnline.xsl" StyleName="APA" Version="6"/>
 </file>
 
 <file path=customXml/itemProps1.xml><?xml version="1.0" encoding="utf-8"?>
-<ds:datastoreItem xmlns:ds="http://schemas.openxmlformats.org/officeDocument/2006/customXml" ds:itemID="{492A4094-C0CE-4806-A03B-AA967586A57B}">
+<ds:datastoreItem xmlns:ds="http://schemas.openxmlformats.org/officeDocument/2006/customXml" ds:itemID="{A2F67D70-1D7D-41F5-917E-8D20C262458F}">
   <ds:schemaRefs>
-    <ds:schemaRef ds:uri="http://schemas.openxmlformats.org/officeDocument/2006/bibliography"/>
+    <ds:schemaRef ds:uri="http://schemas.microsoft.com/office/2006/metadata/properties"/>
+    <ds:schemaRef ds:uri="http://schemas.microsoft.com/office/infopath/2007/PartnerControls"/>
+    <ds:schemaRef ds:uri="308fd9e7-0be8-44ba-81f3-723628cb95d5"/>
   </ds:schemaRefs>
 </ds:datastoreItem>
 </file>
 
 <file path=customXml/itemProps2.xml><?xml version="1.0" encoding="utf-8"?>
+<ds:datastoreItem xmlns:ds="http://schemas.openxmlformats.org/officeDocument/2006/customXml" ds:itemID="{894FF3D7-A3AD-4389-89EC-D084FE70A6B4}">
+  <ds:schemaRefs>
+    <ds:schemaRef ds:uri="http://schemas.microsoft.com/sharepoint/v3/contenttype/forms"/>
+  </ds:schemaRefs>
+</ds:datastoreItem>
+</file>
+
+<file path=customXml/itemProps3.xml><?xml version="1.0" encoding="utf-8"?>
 <ds:datastoreItem xmlns:ds="http://schemas.openxmlformats.org/officeDocument/2006/customXml" ds:itemID="{4694D7C3-DDF8-411A-A9D5-2382FE8DD951}">
   <ds:schemaRefs>
     <ds:schemaRef ds:uri="http://schemas.microsoft.com/office/2006/metadata/contentType"/>
@@ -2316,20 +4758,10 @@
 </ds:datastoreItem>
 </file>
 
-<file path=customXml/itemProps3.xml><?xml version="1.0" encoding="utf-8"?>
-<ds:datastoreItem xmlns:ds="http://schemas.openxmlformats.org/officeDocument/2006/customXml" ds:itemID="{894FF3D7-A3AD-4389-89EC-D084FE70A6B4}">
+<file path=customXml/itemProps4.xml><?xml version="1.0" encoding="utf-8"?>
+<ds:datastoreItem xmlns:ds="http://schemas.openxmlformats.org/officeDocument/2006/customXml" ds:itemID="{492A4094-C0CE-4806-A03B-AA967586A57B}">
   <ds:schemaRefs>
-    <ds:schemaRef ds:uri="http://schemas.microsoft.com/sharepoint/v3/contenttype/forms"/>
-  </ds:schemaRefs>
-</ds:datastoreItem>
-</file>
-
-<file path=customXml/itemProps4.xml><?xml version="1.0" encoding="utf-8"?>
-<ds:datastoreItem xmlns:ds="http://schemas.openxmlformats.org/officeDocument/2006/customXml" ds:itemID="{A2F67D70-1D7D-41F5-917E-8D20C262458F}">
-  <ds:schemaRefs>
-    <ds:schemaRef ds:uri="http://schemas.microsoft.com/office/2006/metadata/properties"/>
-    <ds:schemaRef ds:uri="http://schemas.microsoft.com/office/infopath/2007/PartnerControls"/>
-    <ds:schemaRef ds:uri="308fd9e7-0be8-44ba-81f3-723628cb95d5"/>
+    <ds:schemaRef ds:uri="http://schemas.openxmlformats.org/officeDocument/2006/bibliography"/>
   </ds:schemaRefs>
 </ds:datastoreItem>
 </file>
</xml_diff>